<commit_message>
Add truck-ready persistence and human review
</commit_message>
<xml_diff>
--- a/thesis/Jetson_Litter_Detection_Thesis_Draft.docx
+++ b/thesis/Jetson_Litter_Detection_Thesis_Draft.docx
@@ -1012,6 +1012,96 @@
           <w:sz w:val="22"/>
           <w:szCs w:val="22"/>
         </w:rPr>
+        <w:t xml:space="preserve">persist run and count records locally when the network is unavailable;</w:t>
+      </w:r>
+    </w:p>
+    <w:p>
+      <w:pPr>
+        <w:pStyle w:val="ListParagraph"/>
+        <w:numPr>
+          <w:ilvl w:val="0"/>
+          <w:numId w:val="3"/>
+        </w:numPr>
+        <w:spacing w:after="140" w:line="330"/>
+      </w:pPr>
+      <w:r>
+        <w:rPr>
+          <w:rFonts w:ascii="Arial" w:cs="Arial" w:eastAsia="Arial" w:hAnsi="Arial"/>
+          <w:sz w:val="22"/>
+          <w:szCs w:val="22"/>
+        </w:rPr>
+        <w:t xml:space="preserve">associate observations with an edge device, vehicle, and route;</w:t>
+      </w:r>
+    </w:p>
+    <w:p>
+      <w:pPr>
+        <w:pStyle w:val="ListParagraph"/>
+        <w:numPr>
+          <w:ilvl w:val="0"/>
+          <w:numId w:val="3"/>
+        </w:numPr>
+        <w:spacing w:after="140" w:line="330"/>
+      </w:pPr>
+      <w:r>
+        <w:rPr>
+          <w:rFonts w:ascii="Arial" w:cs="Arial" w:eastAsia="Arial" w:hAnsi="Arial"/>
+          <w:sz w:val="22"/>
+          <w:szCs w:val="22"/>
+        </w:rPr>
+        <w:t xml:space="preserve">show a human the predicted material and configured separation destination;</w:t>
+      </w:r>
+    </w:p>
+    <w:p>
+      <w:pPr>
+        <w:pStyle w:val="ListParagraph"/>
+        <w:numPr>
+          <w:ilvl w:val="0"/>
+          <w:numId w:val="3"/>
+        </w:numPr>
+        <w:spacing w:after="140" w:line="330"/>
+      </w:pPr>
+      <w:r>
+        <w:rPr>
+          <w:rFonts w:ascii="Arial" w:cs="Arial" w:eastAsia="Arial" w:hAnsi="Arial"/>
+          <w:sz w:val="22"/>
+          <w:szCs w:val="22"/>
+        </w:rPr>
+        <w:t xml:space="preserve">queue uncertain items for human confirmation, correction, or rejection;</w:t>
+      </w:r>
+    </w:p>
+    <w:p>
+      <w:pPr>
+        <w:pStyle w:val="ListParagraph"/>
+        <w:numPr>
+          <w:ilvl w:val="0"/>
+          <w:numId w:val="3"/>
+        </w:numPr>
+        <w:spacing w:after="140" w:line="330"/>
+      </w:pPr>
+      <w:r>
+        <w:rPr>
+          <w:rFonts w:ascii="Arial" w:cs="Arial" w:eastAsia="Arial" w:hAnsi="Arial"/>
+          <w:sz w:val="22"/>
+          <w:szCs w:val="22"/>
+        </w:rPr>
+        <w:t xml:space="preserve">distinguish observed litter from externally confirmed collected material;</w:t>
+      </w:r>
+    </w:p>
+    <w:p>
+      <w:pPr>
+        <w:pStyle w:val="ListParagraph"/>
+        <w:numPr>
+          <w:ilvl w:val="0"/>
+          <w:numId w:val="3"/>
+        </w:numPr>
+        <w:spacing w:after="140" w:line="330"/>
+      </w:pPr>
+      <w:r>
+        <w:rPr>
+          <w:rFonts w:ascii="Arial" w:cs="Arial" w:eastAsia="Arial" w:hAnsi="Arial"/>
+          <w:sz w:val="22"/>
+          <w:szCs w:val="22"/>
+        </w:rPr>
         <w:t xml:space="preserve">optionally save annotated media and structured JSON evidence;</w:t>
       </w:r>
     </w:p>
@@ -1190,6 +1280,24 @@
           <w:sz w:val="22"/>
           <w:szCs w:val="22"/>
         </w:rPr>
+        <w:t xml:space="preserve">preserve operational records across process and vehicle restarts;</w:t>
+      </w:r>
+    </w:p>
+    <w:p>
+      <w:pPr>
+        <w:pStyle w:val="ListParagraph"/>
+        <w:numPr>
+          <w:ilvl w:val="0"/>
+          <w:numId w:val="3"/>
+        </w:numPr>
+        <w:spacing w:after="140" w:line="330"/>
+      </w:pPr>
+      <w:r>
+        <w:rPr>
+          <w:rFonts w:ascii="Arial" w:cs="Arial" w:eastAsia="Arial" w:hAnsi="Arial"/>
+          <w:sz w:val="22"/>
+          <w:szCs w:val="22"/>
+        </w:rPr>
         <w:t xml:space="preserve">operate within the target device's memory and thermal limits;</w:t>
       </w:r>
     </w:p>
@@ -1208,6 +1316,24 @@
           <w:sz w:val="22"/>
           <w:szCs w:val="22"/>
         </w:rPr>
+        <w:t xml:space="preserve">keep all mechanical actuation under an independent safety-rated controller;</w:t>
+      </w:r>
+    </w:p>
+    <w:p>
+      <w:pPr>
+        <w:pStyle w:val="ListParagraph"/>
+        <w:numPr>
+          <w:ilvl w:val="0"/>
+          <w:numId w:val="3"/>
+        </w:numPr>
+        <w:spacing w:after="140" w:line="330"/>
+      </w:pPr>
+      <w:r>
+        <w:rPr>
+          <w:rFonts w:ascii="Arial" w:cs="Arial" w:eastAsia="Arial" w:hAnsi="Arial"/>
+          <w:sz w:val="22"/>
+          <w:szCs w:val="22"/>
+        </w:rPr>
         <w:t xml:space="preserve">fail clearly when required models, data, or calibration inputs are absent;</w:t>
       </w:r>
     </w:p>
@@ -1247,7 +1373,20 @@
           <w:sz w:val="22"/>
           <w:szCs w:val="22"/>
         </w:rPr>
-        <w:t xml:space="preserve">The runtime path is camera or media input, RF-DETR preprocessing, an optimized detector runtime, standard detection records, class-stabilized tracking, counting, and local event handling. It reports current visible objects separately from unique confirmed track IDs encountered during the session. Evidence is written as streaming JSON Lines plus an end-of-run summary. A selected-frame VLM, if enabled later, is downstream and asynchronous.</w:t>
+        <w:t xml:space="preserve">The runtime path is camera or media input, RF-DETR preprocessing, an optimized detector runtime, standard detection records, class-stabilized tracking, counting, and local event handling. It reports current visible objects separately from unique confirmed track IDs encountered during the session. Evidence is written as streaming JSON Lines plus an end-of-run summary. An offline SQLite store retains run metadata, per-frame count snapshots, optional detections, human-review tasks, explicit collection confirmations, and durable events for a fleet connector. Vehicle, route, and edge-device identifiers make the records usable by a larger truck platform.</w:t>
+      </w:r>
+    </w:p>
+    <w:p>
+      <w:pPr>
+        <w:spacing w:after="140" w:line="330"/>
+      </w:pPr>
+      <w:r>
+        <w:rPr>
+          <w:rFonts w:ascii="Arial" w:cs="Arial" w:eastAsia="Arial" w:hAnsi="Arial"/>
+          <w:sz w:val="22"/>
+          <w:szCs w:val="22"/>
+        </w:rPr>
+        <w:t xml:space="preserve">The runtime applies an operator-configured separation policy after tracking. The display presents the predicted material and destination, while low-confidence and other-litter observations are placed in a review queue. Detected objects remain observations; they are not recorded as collected until a human, arm controller, sensor-fusion component, or reviewed import provides a separate positive confirmation. Perception output may inform a task planner but must not directly actuate a collection arm; final motion authority, emergency stops, exclusion zones, and interlocks remain in an independent safety-rated controller. A selected-frame VLM, if enabled later, is downstream and asynchronous.</w:t>
       </w:r>
     </w:p>
     <w:p>
@@ -1295,6 +1434,19 @@
           <w:szCs w:val="22"/>
         </w:rPr>
         <w:t xml:space="preserve">RF-DETR Nano is accepted for the use case only if it exports to a supported edge runtime, loads with sufficient memory headroom, completes representative media without unsupported operators or crashes, and meets the frozen detection, classification, and counting accuracy requirements.</w:t>
+      </w:r>
+    </w:p>
+    <w:p>
+      <w:pPr>
+        <w:spacing w:after="140" w:line="330"/>
+      </w:pPr>
+      <w:r>
+        <w:rPr>
+          <w:rFonts w:ascii="Arial" w:cs="Arial" w:eastAsia="Arial" w:hAnsi="Arial"/>
+          <w:sz w:val="22"/>
+          <w:szCs w:val="22"/>
+        </w:rPr>
+        <w:t xml:space="preserve">For the human-assistance use case, acceptance also requires that separation destinations are configurable, uncertain items remain reviewable, corrections are auditable, and detected-versus-collected counts cannot be conflated.</w:t>
       </w:r>
     </w:p>
     <w:p>

</xml_diff>

<commit_message>
Make public zero-shot model the default
</commit_message>
<xml_diff>
--- a/thesis/Jetson_Litter_Detection_Thesis_Draft.docx
+++ b/thesis/Jetson_Litter_Detection_Thesis_Draft.docx
@@ -103,7 +103,7 @@
           <w:sz w:val="22"/>
           <w:szCs w:val="22"/>
         </w:rPr>
-        <w:t xml:space="preserve">Abiola A. Babsalaam Prospective MSc research revision 20 October 2026</w:t>
+        <w:t xml:space="preserve">Abiola A. Babsalaam Prospective MSc research revision 21 October 2026</w:t>
       </w:r>
     </w:p>
     <w:p>
@@ -124,7 +124,7 @@
           <w:sz w:val="22"/>
           <w:szCs w:val="22"/>
         </w:rPr>
-        <w:t xml:space="preserve">Litter in public spaces creates environmental, social, and economic costs, yet manual inspection is difficult to sustain across large urban areas. This study proposes an edge-computing system for detecting, classifying, tracking, and counting visible litter with a compact object detector deployed on a confirmed NVIDIA Jetson Orin Nano 8 GB Super device. The system uses RF-DETR Nano behind a portable runtime adapter. The implementation must prove export and runtime compatibility and will be evaluated on target-domain accuracy, minority-class recall, count error, latency, throughput, memory, power, temperature, and sustained stability. The model will be trained on a separate GPU environment and evaluated on the Jetson through a supported deployment path. The proposed class taxonomy contains glass, metal, paper/cardboard, plastic, and other litter, subject to revision after a labeling pilot. Data will be split by collection site and session to reduce leakage from near-duplicate video frames. Privacy controls will exclude identity analysis and minimize the capture and retention of identifiable people, vehicles, and locations. At the time of this revision, new data collection, model training, and Jetson testing have not been completed. Accordingly, this manuscript presents the research motivation, design, reproducible methods, and analysis plan without claiming new accuracy or real-time performance results.</w:t>
+        <w:t xml:space="preserve">Litter in public spaces creates environmental, social, and economic costs, yet manual inspection is difficult to sustain across large urban areas. This study proposes an edge-computing system for detecting, classifying, tracking, and counting visible litter with a public open-vocabulary detector deployed on a confirmed NVIDIA Jetson Orin Nano 8 GB Super device. The system uses Grounding DINO Tiny behind a portable runtime adapter and does not require a newly trained project checkpoint. It will be evaluated on target-domain accuracy, class recall, count error, latency, throughput, memory, power, temperature, and sustained stability. The operational configuration contains 16 configurable litter prompts covering common containers, packaging, paper, cigarette waste, organics, textiles, tires, hazardous items, and other litter. Evaluation data will be grouped by collection site and session to reduce leakage from near-duplicate video frames. Privacy controls will exclude identity analysis and minimize the capture and retention of identifiable people, vehicles, and locations. At the time of this revision, representative evaluation data and Jetson testing have not been completed. Accordingly, this manuscript presents the research motivation, design, reproducible methods, and analysis plan without claiming new accuracy or real-time performance results.</w:t>
       </w:r>
     </w:p>
     <w:p>
@@ -200,20 +200,20 @@
           <w:sz w:val="22"/>
           <w:szCs w:val="22"/>
         </w:rPr>
-        <w:t xml:space="preserve">The revised system is portable and targets a confirmed NVIDIA Jetson Orin Nano Engineering Reference Developer Kit Super with 8 GB-class shared memory. The device runs JetPack 6.2.3/L4T 36.5.2 and is shared with active application and LLM services. RF-DETR Nano is the implementation model. The reusable software separates RF-DETR inference from a standard detection schema, tracking, class stabilization, and counting. The deployment is accepted only if it can run with enough memory headroom for media processing, evidence logging, the operating system, and the device's existing workload.</w:t>
-      </w:r>
-    </w:p>
-    <w:p>
-      <w:pPr>
-        <w:spacing w:after="140" w:line="330"/>
-      </w:pPr>
-      <w:r>
-        <w:rPr>
-          <w:rFonts w:ascii="Arial" w:cs="Arial" w:eastAsia="Arial" w:hAnsi="Arial"/>
-          <w:sz w:val="22"/>
-          <w:szCs w:val="22"/>
-        </w:rPr>
-        <w:t xml:space="preserve">Training is performed off-device. The Jetson is reserved for export validation, inference, and systems evaluation during an approved test window. The existing project and its services will not be stopped or reconfigured for this study.</w:t>
+        <w:t xml:space="preserve">The revised system is portable and targets a confirmed NVIDIA Jetson Orin Nano Engineering Reference Developer Kit Super with 8 GB-class shared memory. The device runs JetPack 6.2.3/L4T 36.5.2 and is shared with active application and LLM services. Public Grounding DINO Tiny is the default implementation model. The reusable software separates detector inference from a standard detection schema, tracking, class stabilization, counting, SQLite persistence, human review, and fleet integration. The deployment is accepted only if it can run with enough memory headroom for media processing, evidence logging, the operating system, and the device's existing workload.</w:t>
+      </w:r>
+    </w:p>
+    <w:p>
+      <w:pPr>
+        <w:spacing w:after="140" w:line="330"/>
+      </w:pPr>
+      <w:r>
+        <w:rPr>
+          <w:rFonts w:ascii="Arial" w:cs="Arial" w:eastAsia="Arial" w:hAnsi="Arial"/>
+          <w:sz w:val="22"/>
+          <w:szCs w:val="22"/>
+        </w:rPr>
+        <w:t xml:space="preserve">No project-specific training is required for the baseline study. The Jetson is reserved for runtime validation, inference, and systems evaluation during an approved test window. Optional custom model training, if later justified by measured errors, would occur off-device. The existing project and its services will not be stopped or reconfigured for this study.</w:t>
       </w:r>
     </w:p>
     <w:p>
@@ -278,7 +278,7 @@
           <w:sz w:val="22"/>
           <w:szCs w:val="22"/>
         </w:rPr>
-        <w:t xml:space="preserve">Assemble a licensed dataset containing public seed data and representative</w:t>
+        <w:t xml:space="preserve">Assemble a licensed evaluation dataset containing representative</w:t>
       </w:r>
     </w:p>
     <w:p>
@@ -309,20 +309,20 @@
           <w:sz w:val="22"/>
           <w:szCs w:val="22"/>
         </w:rPr>
-        <w:t xml:space="preserve">Prevent train-test leakage by splitting data at site, session, or video</w:t>
-      </w:r>
-    </w:p>
-    <w:p>
-      <w:pPr>
-        <w:spacing w:after="140" w:line="330"/>
-      </w:pPr>
-      <w:r>
-        <w:rPr>
-          <w:rFonts w:ascii="Arial" w:cs="Arial" w:eastAsia="Arial" w:hAnsi="Arial"/>
-          <w:sz w:val="22"/>
-          <w:szCs w:val="22"/>
-        </w:rPr>
-        <w:t xml:space="preserve">sequence level.</w:t>
+        <w:t xml:space="preserve">Prevent configuration-test leakage by grouping prompt-development and test</w:t>
+      </w:r>
+    </w:p>
+    <w:p>
+      <w:pPr>
+        <w:spacing w:after="140" w:line="330"/>
+      </w:pPr>
+      <w:r>
+        <w:rPr>
+          <w:rFonts w:ascii="Arial" w:cs="Arial" w:eastAsia="Arial" w:hAnsi="Arial"/>
+          <w:sz w:val="22"/>
+          <w:szCs w:val="22"/>
+        </w:rPr>
+        <w:t xml:space="preserve">data at site, session, or video sequence level.</w:t>
       </w:r>
     </w:p>
     <w:p>
@@ -358,7 +358,20 @@
           <w:sz w:val="22"/>
           <w:szCs w:val="22"/>
         </w:rPr>
-        <w:t xml:space="preserve">Train RF-DETR Nano under controlled and reproducible conditions.</w:t>
+        <w:t xml:space="preserve">Configure and freeze the public Grounding DINO Tiny prompt catalog and</w:t>
+      </w:r>
+    </w:p>
+    <w:p>
+      <w:pPr>
+        <w:spacing w:after="140" w:line="330"/>
+      </w:pPr>
+      <w:r>
+        <w:rPr>
+          <w:rFonts w:ascii="Arial" w:cs="Arial" w:eastAsia="Arial" w:hAnsi="Arial"/>
+          <w:sz w:val="22"/>
+          <w:szCs w:val="22"/>
+        </w:rPr>
+        <w:t xml:space="preserve">thresholds without training a new checkpoint.</w:t>
       </w:r>
     </w:p>
     <w:p>
@@ -376,7 +389,7 @@
           <w:sz w:val="22"/>
           <w:szCs w:val="22"/>
         </w:rPr>
-        <w:t xml:space="preserve">Export and validate the intended deployment artifact on the target Jetson.</w:t>
+        <w:t xml:space="preserve">Validate the intended runtime on the target Jetson.</w:t>
       </w:r>
     </w:p>
     <w:p>
@@ -394,7 +407,20 @@
           <w:sz w:val="22"/>
           <w:szCs w:val="22"/>
         </w:rPr>
-        <w:t xml:space="preserve">Evaluate INT8 only after representative calibration data is available.</w:t>
+        <w:t xml:space="preserve">Treat model export or custom training as optional optimization only when</w:t>
+      </w:r>
+    </w:p>
+    <w:p>
+      <w:pPr>
+        <w:spacing w:after="140" w:line="330"/>
+      </w:pPr>
+      <w:r>
+        <w:rPr>
+          <w:rFonts w:ascii="Arial" w:cs="Arial" w:eastAsia="Arial" w:hAnsi="Arial"/>
+          <w:sz w:val="22"/>
+          <w:szCs w:val="22"/>
+        </w:rPr>
+        <w:t xml:space="preserve">baseline measurements justify it.</w:t>
       </w:r>
     </w:p>
     <w:p>
@@ -487,7 +513,7 @@
           <w:sz w:val="22"/>
           <w:szCs w:val="22"/>
         </w:rPr>
-        <w:t xml:space="preserve">and privacy permit—data and trained artifacts.</w:t>
+        <w:t xml:space="preserve">and privacy permit—evaluation data and derived artifacts.</w:t>
       </w:r>
     </w:p>
     <w:p>
@@ -513,7 +539,7 @@
           <w:sz w:val="22"/>
           <w:szCs w:val="22"/>
         </w:rPr>
-        <w:t xml:space="preserve">RQ1: How accurately does the RF-DETR Nano implementation detect and classify</w:t>
+        <w:t xml:space="preserve">RQ1: How accurately does the Grounding DINO Tiny implementation detect and classify</w:t>
       </w:r>
     </w:p>
     <w:p>
@@ -671,7 +697,7 @@
           <w:sz w:val="22"/>
           <w:szCs w:val="22"/>
         </w:rPr>
-        <w:t xml:space="preserve">The intended contribution is not a new neural-network architecture. It is a well-documented applied study that connects dataset governance, controlled detector training, reusable hardware adapters, tracking-based counting, Jetson optimization, systems benchmarking, privacy constraints, and honest publication of limitations. The repository is designed so that the methods can be inspected before results exist and the final claims can be traced to machine-readable evidence.</w:t>
+        <w:t xml:space="preserve">The intended contribution is not a new neural-network architecture. It is a well-documented applied study that connects a public reusable detector, configurable open-vocabulary categories, dataset governance, reusable hardware adapters, tracking-based counting, Jetson validation, systems benchmarking, privacy constraints, and honest publication of limitations. The repository is designed so that the application works before study results exist and the final claims can be traced to machine-readable evidence.</w:t>
       </w:r>
     </w:p>
     <w:p>
@@ -773,7 +799,7 @@
           <w:sz w:val="22"/>
           <w:szCs w:val="22"/>
         </w:rPr>
-        <w:t xml:space="preserve">RF-DETR Nano is the selected implementation. RF-DETR is a real-time detection-transformer family designed for fine-tuning, and its compact Nano variant provides a practical starting point for portable edge deployment. Its Jetson candidacy remains conditional on proving a supported export path and stable execution on the exact target stack with acceptable memory use.</w:t>
+        <w:t xml:space="preserve">Grounding DINO Tiny is the selected public implementation. Grounding DINO is an open-set detector that can detect objects described by text prompts. This supports an operational catalog that can be revised without training a new fixed-class output layer. Its Jetson candidacy remains conditional on stable execution on the exact target stack with acceptable accuracy, latency, and memory use. RF-DETR remains an optional future closed-set specialization, not the baseline requirement.</w:t>
       </w:r>
     </w:p>
     <w:p>
@@ -875,7 +901,7 @@
           <w:sz w:val="22"/>
           <w:szCs w:val="22"/>
         </w:rPr>
-        <w:t xml:space="preserve">Many applied projects report accuracy without a frozen test protocol or call a system "real time" using a model benchmark that omits the full pipeline. Others do not record power mode, thermal state, data leakage controls, or privacy handling. Counting studies may also sum frame detections and therefore count one persistent object repeatedly. The revised study addresses these gaps by specifying evidence before model training, separating target criteria from observed results, and evaluating count error against track-level video ground truth.</w:t>
+        <w:t xml:space="preserve">Many applied projects report accuracy without a frozen test protocol or call a system "real time" using a model benchmark that omits the full pipeline. Others do not record power mode, thermal state, data leakage controls, or privacy handling. Counting studies may also sum frame detections and therefore count one persistent object repeatedly. The revised study addresses these gaps by specifying evidence before deployment testing, separating target criteria from observed results, and evaluating count error against track-level video ground truth.</w:t>
       </w:r>
     </w:p>
     <w:p>
@@ -1334,7 +1360,20 @@
           <w:sz w:val="22"/>
           <w:szCs w:val="22"/>
         </w:rPr>
-        <w:t xml:space="preserve">fail clearly when required models, data, or calibration inputs are absent;</w:t>
+        <w:t xml:space="preserve">download/cache the public model automatically and fail clearly when required</w:t>
+      </w:r>
+    </w:p>
+    <w:p>
+      <w:pPr>
+        <w:spacing w:after="140" w:line="330"/>
+      </w:pPr>
+      <w:r>
+        <w:rPr>
+          <w:rFonts w:ascii="Arial" w:cs="Arial" w:eastAsia="Arial" w:hAnsi="Arial"/>
+          <w:sz w:val="22"/>
+          <w:szCs w:val="22"/>
+        </w:rPr>
+        <w:t xml:space="preserve">runtime assets or inputs are unavailable;</w:t>
       </w:r>
     </w:p>
     <w:p>
@@ -1373,46 +1412,46 @@
           <w:sz w:val="22"/>
           <w:szCs w:val="22"/>
         </w:rPr>
-        <w:t xml:space="preserve">The runtime path is camera or media input, RF-DETR preprocessing, an optimized detector runtime, standard detection records, class-stabilized tracking, counting, and local event handling. It reports current visible objects separately from unique confirmed track IDs encountered during the session. Evidence is written as streaming JSON Lines plus an end-of-run summary. An offline SQLite store retains run metadata, per-frame count snapshots, optional detections, human-review tasks, explicit collection confirmations, and durable events for a fleet connector. Vehicle, route, and edge-device identifiers make the records usable by a larger truck platform.</w:t>
-      </w:r>
-    </w:p>
-    <w:p>
-      <w:pPr>
-        <w:spacing w:after="140" w:line="330"/>
-      </w:pPr>
-      <w:r>
-        <w:rPr>
-          <w:rFonts w:ascii="Arial" w:cs="Arial" w:eastAsia="Arial" w:hAnsi="Arial"/>
-          <w:sz w:val="22"/>
-          <w:szCs w:val="22"/>
-        </w:rPr>
-        <w:t xml:space="preserve">The runtime applies an operator-configured separation policy after tracking. The display presents the predicted material and destination, while low-confidence and other-litter observations are placed in a review queue. Detected objects remain observations; they are not recorded as collected until a human, arm controller, sensor-fusion component, or reviewed import provides a separate positive confirmation. Perception output may inform a task planner but must not directly actuate a collection arm; final motion authority, emergency stops, exclusion zones, and interlocks remain in an independent safety-rated controller. A selected-frame VLM, if enabled later, is downstream and asynchronous.</w:t>
-      </w:r>
-    </w:p>
-    <w:p>
-      <w:pPr>
-        <w:spacing w:after="140" w:line="330"/>
-      </w:pPr>
-      <w:r>
-        <w:rPr>
-          <w:rFonts w:ascii="Arial" w:cs="Arial" w:eastAsia="Arial" w:hAnsi="Arial"/>
-          <w:sz w:val="22"/>
-          <w:szCs w:val="22"/>
-        </w:rPr>
-        <w:t xml:space="preserve">The reusable software is a deliverable separate from this manuscript. Its `startup.sh` entry point automates environment preparation, verified checkpoint installation, source discovery, inference, and timestamped evidence output. The thesis will cite the exact public Git commit and artifact checksums used for each experiment; the software does not require the thesis in order to run.</w:t>
-      </w:r>
-    </w:p>
-    <w:p>
-      <w:pPr>
-        <w:spacing w:after="140" w:line="330"/>
-      </w:pPr>
-      <w:r>
-        <w:rPr>
-          <w:rFonts w:ascii="Arial" w:cs="Arial" w:eastAsia="Arial" w:hAnsi="Arial"/>
-          <w:sz w:val="22"/>
-          <w:szCs w:val="22"/>
-        </w:rPr>
-        <w:t xml:space="preserve">Training occurs on a GPU host using versioned configuration and data. The best checkpoint is transferred to the target deployment environment. The export manifest records the source weights, format, precision, image size, software versions, and calibration data where applicable. Each CPU, NVIDIA, AMD, or Jetson deployment retains its own manifest; evidence from one device is not generalized to another.</w:t>
+        <w:t xml:space="preserve">The runtime path is camera or media input, Grounding DINO preprocessing, a public detector runtime, standard detection records, class-stabilized tracking, counting, and local event handling. It reports current visible objects separately from unique confirmed track IDs encountered during the session. Evidence is written as streaming JSON Lines plus an end-of-run summary. An offline SQLite store retains run metadata, per-frame count snapshots, optional detections, human-review tasks, explicit collection confirmations, and durable events for a fleet connector. Vehicle, route, and edge-device identifiers make the records usable by a larger truck platform.</w:t>
+      </w:r>
+    </w:p>
+    <w:p>
+      <w:pPr>
+        <w:spacing w:after="140" w:line="330"/>
+      </w:pPr>
+      <w:r>
+        <w:rPr>
+          <w:rFonts w:ascii="Arial" w:cs="Arial" w:eastAsia="Arial" w:hAnsi="Arial"/>
+          <w:sz w:val="22"/>
+          <w:szCs w:val="22"/>
+        </w:rPr>
+        <w:t xml:space="preserve">The runtime applies an operator-configured separation policy after tracking. The display presents the predicted material and destination, while low-confidence, hazardous, and other-litter observations are placed in a review queue. Detected objects remain observations; they are not recorded as collected until a human, arm controller, sensor-fusion component, or reviewed import provides a separate positive confirmation. Perception output may inform a task planner but must not directly actuate a collection arm; final motion authority, emergency stops, exclusion zones, and interlocks remain in an independent safety-rated controller. A selected-frame VLM, if enabled later, is downstream and asynchronous.</w:t>
+      </w:r>
+    </w:p>
+    <w:p>
+      <w:pPr>
+        <w:spacing w:after="140" w:line="330"/>
+      </w:pPr>
+      <w:r>
+        <w:rPr>
+          <w:rFonts w:ascii="Arial" w:cs="Arial" w:eastAsia="Arial" w:hAnsi="Arial"/>
+          <w:sz w:val="22"/>
+          <w:szCs w:val="22"/>
+        </w:rPr>
+        <w:t xml:space="preserve">The reusable software is a deliverable separate from this manuscript. Its `startup.sh` entry point automates environment preparation, public-model download and caching, source discovery, inference, and timestamped evidence output. The thesis will cite the exact public Git commit and artifact checksums used for each experiment; the software does not require the thesis in order to run.</w:t>
+      </w:r>
+    </w:p>
+    <w:p>
+      <w:pPr>
+        <w:spacing w:after="140" w:line="330"/>
+      </w:pPr>
+      <w:r>
+        <w:rPr>
+          <w:rFonts w:ascii="Arial" w:cs="Arial" w:eastAsia="Arial" w:hAnsi="Arial"/>
+          <w:sz w:val="22"/>
+          <w:szCs w:val="22"/>
+        </w:rPr>
+        <w:t xml:space="preserve">The baseline uses a public checkpoint and versioned prompts rather than a new training run. Each CPU, NVIDIA, AMD, or Jetson deployment retains its own manifest containing the model identifier, configuration, software versions, device details, and any optimized artifact checksum. Evidence from one device is not generalized to another.</w:t>
       </w:r>
     </w:p>
     <w:p>
@@ -1433,7 +1472,7 @@
           <w:sz w:val="22"/>
           <w:szCs w:val="22"/>
         </w:rPr>
-        <w:t xml:space="preserve">RF-DETR Nano is accepted for the use case only if it exports to a supported edge runtime, loads with sufficient memory headroom, completes representative media without unsupported operators or crashes, and meets the frozen detection, classification, and counting accuracy requirements.</w:t>
+        <w:t xml:space="preserve">Grounding DINO Tiny is accepted for the use case only if it loads with sufficient memory headroom, completes representative media without unsupported operators or crashes, and meets the frozen detection, classification, and counting accuracy requirements. An optimized runtime artifact is optional, but must preserve acceptable output if used.</w:t>
       </w:r>
     </w:p>
     <w:p>
@@ -1501,7 +1540,7 @@
           <w:sz w:val="22"/>
           <w:szCs w:val="22"/>
         </w:rPr>
-        <w:t xml:space="preserve">The study is an empirical design-and-evaluation project. It combines controlled model development with measurement of an implemented edge system. Threshold selection will use validation data; the held-out test set will be used only after training and threshold choices are frozen.</w:t>
+        <w:t xml:space="preserve">The study is an empirical design-and-evaluation project. It combines controlled prompt and threshold configuration with measurement of an implemented edge system. Prompt and threshold selection will use development data; the held-out test set will be used only after configuration choices are frozen.</w:t>
       </w:r>
     </w:p>
     <w:p>
@@ -1556,7 +1595,7 @@
           <w:sz w:val="22"/>
           <w:szCs w:val="22"/>
         </w:rPr>
-        <w:t xml:space="preserve">The provisional classes are glass, metal, paper/cardboard, plastic, and other litter. A pilot will test whether annotators can apply these classes consistently. If material cannot be reliably inferred, the ontology will be revised before large-scale labeling. Every change will increment the dataset schema version.</w:t>
+        <w:t xml:space="preserve">The operational catalog begins with 16 categories: plastic bottle, glass bottle, metal can, paper, cardboard, plastic bag, food wrapper, disposable cup, cigarette butt, food waste, textile, tire, battery, electronic waste, broken glass, and other litter. The prompts can be revised without retraining, but the stable output schema will be versioned. A labeling review will test whether these categories can be applied consistently. If material cannot be inferred reliably, the system will prefer an ambiguous/manual-review outcome.</w:t>
       </w:r>
     </w:p>
     <w:p>
@@ -1698,7 +1737,7 @@
           <w:sz w:val="22"/>
           <w:szCs w:val="22"/>
         </w:rPr>
-        <w:t xml:space="preserve">A pilot subset will be labeled by at least two annotators where feasible. Disagreement will be reviewed to refine the guide. Automated validation will check class IDs, coordinates, empty or corrupt files, duplicate images, and boxes outside image boundaries. Class and object-size distributions will be reported before training.</w:t>
+        <w:t xml:space="preserve">A quality-control subset will be labeled by at least two annotators where feasible. Disagreement will be reviewed to refine the guide. Automated validation will check class IDs, coordinates, empty or corrupt files, duplicate images, and boxes outside image boundaries. Class and object-size distributions will be reported before final evaluation.</w:t>
       </w:r>
     </w:p>
     <w:p>
@@ -1719,20 +1758,20 @@
           <w:sz w:val="22"/>
           <w:szCs w:val="22"/>
         </w:rPr>
-        <w:t xml:space="preserve">Adjacent video frames and repeated views of the same scene are highly correlated. Random image-level splitting can place nearly identical content in training and test sets and inflate performance. The data will therefore be grouped by collection site, session, or source video before assignment to training, validation, and test partitions.</w:t>
-      </w:r>
-    </w:p>
-    <w:p>
-      <w:pPr>
-        <w:spacing w:after="140" w:line="330"/>
-      </w:pPr>
-      <w:r>
-        <w:rPr>
-          <w:rFonts w:ascii="Arial" w:cs="Arial" w:eastAsia="Arial" w:hAnsi="Arial"/>
-          <w:sz w:val="22"/>
-          <w:szCs w:val="22"/>
-        </w:rPr>
-        <w:t xml:space="preserve">A provisional 70/15/15 group split will be used, subject to adjustment for class coverage. Augmentation is applied only after splitting. The test partition will be frozen and checksummed before final accuracy evaluation.</w:t>
+        <w:t xml:space="preserve">Adjacent video frames and repeated views of the same scene are highly correlated. Random image-level splitting can place nearly identical content in prompt-development and test sets and inflate performance. The data will therefore be grouped by collection site, session, or source video before assignment to development and held-out test partitions.</w:t>
+      </w:r>
+    </w:p>
+    <w:p>
+      <w:pPr>
+        <w:spacing w:after="140" w:line="330"/>
+      </w:pPr>
+      <w:r>
+        <w:rPr>
+          <w:rFonts w:ascii="Arial" w:cs="Arial" w:eastAsia="Arial" w:hAnsi="Arial"/>
+          <w:sz w:val="22"/>
+          <w:szCs w:val="22"/>
+        </w:rPr>
+        <w:t xml:space="preserve">A grouped development/test split will be chosen after the source inventory is known and before prompt tuning. The test partition will be frozen and checksummed before final accuracy evaluation.</w:t>
       </w:r>
     </w:p>
     <w:p>
@@ -1740,46 +1779,33 @@
         <w:pStyle w:val="Heading2"/>
       </w:pPr>
       <w:r>
-        <w:t xml:space="preserve">4.6 Training</w:t>
-      </w:r>
-    </w:p>
-    <w:p>
-      <w:pPr>
-        <w:spacing w:after="140" w:line="330"/>
-      </w:pPr>
-      <w:r>
-        <w:rPr>
-          <w:rFonts w:ascii="Arial" w:cs="Arial" w:eastAsia="Arial" w:hAnsi="Arial"/>
-          <w:sz w:val="22"/>
-          <w:szCs w:val="22"/>
-        </w:rPr>
-        <w:t xml:space="preserve">RF-DETR Nano will begin from official pretrained weights. The dataset version, augmentations, optimization settings, and resolved batch size will be retained in the run artifacts.</w:t>
-      </w:r>
-    </w:p>
-    <w:p>
-      <w:pPr>
-        <w:spacing w:after="140" w:line="330"/>
-      </w:pPr>
-      <w:r>
-        <w:rPr>
-          <w:rFonts w:ascii="Arial" w:cs="Arial" w:eastAsia="Arial" w:hAnsi="Arial"/>
-          <w:sz w:val="22"/>
-          <w:szCs w:val="22"/>
-        </w:rPr>
-        <w:t xml:space="preserve">Each run will preserve its framework arguments, training curves, validation metrics, package versions, Git revision, and best checkpoint. If compute permits, at least three seeds will be trained so the reported accuracy does not rely on one random initialization and data order.</w:t>
-      </w:r>
-    </w:p>
-    <w:p>
-      <w:pPr>
-        <w:spacing w:after="140" w:line="330"/>
-      </w:pPr>
-      <w:r>
-        <w:rPr>
-          <w:rFonts w:ascii="Arial" w:cs="Arial" w:eastAsia="Arial" w:hAnsi="Arial"/>
-          <w:sz w:val="22"/>
-          <w:szCs w:val="22"/>
-        </w:rPr>
-        <w:t xml:space="preserve">Hyperparameter tuning, if performed, will use validation data only. The scope and search budget will be disclosed. The test set will not be used to select epochs, augmentations, image size, confidence threshold, or model size.</w:t>
+        <w:t xml:space="preserve">4.6 Public-model configuration</w:t>
+      </w:r>
+    </w:p>
+    <w:p>
+      <w:pPr>
+        <w:spacing w:after="140" w:line="330"/>
+      </w:pPr>
+      <w:r>
+        <w:rPr>
+          <w:rFonts w:ascii="Arial" w:cs="Arial" w:eastAsia="Arial" w:hAnsi="Arial"/>
+          <w:sz w:val="22"/>
+          <w:szCs w:val="22"/>
+        </w:rPr>
+        <w:t xml:space="preserve">The baseline will use the public `IDEA-Research/grounding-dino-tiny` checkpoint. The versioned prompt catalog, confidence threshold, non-maximum-suppression threshold, package versions, Git revision, and model source will be retained in the run artifacts.</w:t>
+      </w:r>
+    </w:p>
+    <w:p>
+      <w:pPr>
+        <w:spacing w:after="140" w:line="330"/>
+      </w:pPr>
+      <w:r>
+        <w:rPr>
+          <w:rFonts w:ascii="Arial" w:cs="Arial" w:eastAsia="Arial" w:hAnsi="Arial"/>
+          <w:sz w:val="22"/>
+          <w:szCs w:val="22"/>
+        </w:rPr>
+        <w:t xml:space="preserve">Prompt and threshold refinement, if performed, will use development data only. The scope of those changes will be disclosed. The held-out test set will not be used to select prompts, image size, confidence threshold, or review policy. Custom training is outside the baseline and will be undertaken only if measured deployment errors justify a separate specialized profile.</w:t>
       </w:r>
     </w:p>
     <w:p>
@@ -1787,33 +1813,33 @@
         <w:pStyle w:val="Heading2"/>
       </w:pPr>
       <w:r>
-        <w:t xml:space="preserve">4.7 Model export</w:t>
-      </w:r>
-    </w:p>
-    <w:p>
-      <w:pPr>
-        <w:spacing w:after="140" w:line="330"/>
-      </w:pPr>
-      <w:r>
-        <w:rPr>
-          <w:rFonts w:ascii="Arial" w:cs="Arial" w:eastAsia="Arial" w:hAnsi="Arial"/>
-          <w:sz w:val="22"/>
-          <w:szCs w:val="22"/>
-        </w:rPr>
-        <w:t xml:space="preserve">The frozen checkpoint will be transferred to the target Jetson only after the read-only hardware inventory and export feasibility review. A supported artifact will be built with a fixed input shape. The source checkpoint and deployment artifact will each have a checksum and manifest. Construction will be repeated after material changes to JetPack, CUDA, TensorRT, or target module.</w:t>
-      </w:r>
-    </w:p>
-    <w:p>
-      <w:pPr>
-        <w:spacing w:after="140" w:line="330"/>
-      </w:pPr>
-      <w:r>
-        <w:rPr>
-          <w:rFonts w:ascii="Arial" w:cs="Arial" w:eastAsia="Arial" w:hAnsi="Arial"/>
-          <w:sz w:val="22"/>
-          <w:szCs w:val="22"/>
-        </w:rPr>
-        <w:t xml:space="preserve">INT8 will be evaluated only after a representative calibration subset is frozen. Calibration data will come from the training distribution, not the held-out test set. INT8 accuracy will be re-evaluated using the same test set and thresholds appropriate to that exported model.</w:t>
+        <w:t xml:space="preserve">4.7 Runtime and optional optimization</w:t>
+      </w:r>
+    </w:p>
+    <w:p>
+      <w:pPr>
+        <w:spacing w:after="140" w:line="330"/>
+      </w:pPr>
+      <w:r>
+        <w:rPr>
+          <w:rFonts w:ascii="Arial" w:cs="Arial" w:eastAsia="Arial" w:hAnsi="Arial"/>
+          <w:sz w:val="22"/>
+          <w:szCs w:val="22"/>
+        </w:rPr>
+        <w:t xml:space="preserve">The public model will be evaluated first through a JetPack-compatible runtime without modifying the shared Jetson. If a target-specific export or optimized platform service is later required, its source model, format, precision, input shape, software versions, and checksum will be recorded.</w:t>
+      </w:r>
+    </w:p>
+    <w:p>
+      <w:pPr>
+        <w:spacing w:after="140" w:line="330"/>
+      </w:pPr>
+      <w:r>
+        <w:rPr>
+          <w:rFonts w:ascii="Arial" w:cs="Arial" w:eastAsia="Arial" w:hAnsi="Arial"/>
+          <w:sz w:val="22"/>
+          <w:szCs w:val="22"/>
+        </w:rPr>
+        <w:t xml:space="preserve">Lower precision will be evaluated only with representative calibration data and a repeated held-out accuracy check. An optimized artifact is accepted only if it preserves the use-case requirements.</w:t>
       </w:r>
     </w:p>
     <w:p>
@@ -1834,7 +1860,7 @@
           <w:sz w:val="22"/>
           <w:szCs w:val="22"/>
         </w:rPr>
-        <w:t xml:space="preserve">The read-only inventory confirmed a Jetson Orin Nano Engineering Reference Developer Kit Super, Ubuntu 22.04.5, kernel 5.15.199-tegra, JetPack 6.2.3, L4T 36.5.2, TensorRT Python 10.3.0, Python 3.10.12, and MAXN_SUPER power mode. The snapshot showed 7.4 GiB total physical memory, 4.5 GiB available memory, approximately 772 GiB available on the root NVMe filesystem, and no attached `/dev/video*` camera. The system Python did not contain PyTorch or RF-DETR. No software was installed and no service or configuration was changed.</w:t>
+        <w:t xml:space="preserve">The read-only inventory confirmed a Jetson Orin Nano Engineering Reference Developer Kit Super, Ubuntu 22.04.5, kernel 5.15.199-tegra, JetPack 6.2.3, L4T 36.5.2, TensorRT Python 10.3.0, Python 3.10.12, and MAXN_SUPER power mode. The snapshot showed 7.4 GiB total physical memory, 4.5 GiB available memory, approximately 772 GiB available on the root NVMe filesystem, and no attached `/dev/video*` camera. The system Python did not contain PyTorch or the project detector runtime. No software was installed and no service or configuration was changed.</w:t>
       </w:r>
     </w:p>
     <w:p>
@@ -1920,7 +1946,7 @@
           <w:sz w:val="22"/>
           <w:szCs w:val="22"/>
         </w:rPr>
-        <w:t xml:space="preserve">The implementation provides a held-out RF-DETR evaluation command and a separate aggregate count evaluator. The latter consumes runtime JSON Lines events and annotated visible/session counts. Duplicate-track, missed-track, and identity-switch rates will be computed only when persistent ground-truth object identities are available; aggregate counts alone cannot support those claims.</w:t>
+        <w:t xml:space="preserve">The implementation provides a reusable inference/benchmark path and a separate aggregate count evaluator. The latter consumes runtime JSON Lines events and annotated visible/session counts. Duplicate-track, missed-track, and identity-switch rates will be computed only when persistent ground-truth object identities are available; aggregate counts alone cannot support those claims.</w:t>
       </w:r>
     </w:p>
     <w:p>
@@ -2255,7 +2281,7 @@
           <w:sz w:val="22"/>
           <w:szCs w:val="22"/>
         </w:rPr>
-        <w:t xml:space="preserve">Edge processing avoids continuous transmission of raw video but still consumes energy and hardware. The study will report power and energy-per-frame evidence where feasible. The selected RF-DETR Nano implementation will be kept only as large as required by the use-case accuracy target. Data and model retraining will be versioned to avoid unnecessary repeated experiments.</w:t>
+        <w:t xml:space="preserve">Edge processing avoids continuous transmission of raw video but still consumes energy and hardware. The study will report power and energy-per-frame evidence where feasible. The selected runtime and prompt catalog will remain only as complex as required by the use-case accuracy target. Custom training will not be introduced unless measured errors show that the public baseline is insufficient.</w:t>
       </w:r>
     </w:p>
     <w:p>
@@ -2276,7 +2302,7 @@
           <w:sz w:val="22"/>
           <w:szCs w:val="22"/>
         </w:rPr>
-        <w:t xml:space="preserve">No new dataset, training run, TensorRT engine, or Jetson benchmark has been completed for this revised study. A read-only hardware inventory has been completed; it is environmental evidence, not a model-performance result. The remaining tables are templates and must not be read as results.</w:t>
+        <w:t xml:space="preserve">No representative evaluation dataset or Jetson benchmark has been completed for this revised study. A read-only hardware inventory and runnable public-model software implementation have been completed; neither is a model-performance result. The remaining tables are templates and must not be read as results.</w:t>
       </w:r>
     </w:p>
     <w:p>
@@ -3199,67 +3225,7 @@
                 <w:sz w:val="18"/>
                 <w:szCs w:val="18"/>
               </w:rPr>
-              <w:t xml:space="preserve">Training images / instances</w:t>
-            </w:r>
-          </w:p>
-        </w:tc>
-        <w:tc>
-          <w:tcPr>
-            <w:tcW w:type="dxa" w:w="4680"/>
-            <w:tcBorders>
-              <w:top w:val="single" w:color="B7B7B7" w:sz="1"/>
-              <w:left w:val="single" w:color="B7B7B7" w:sz="1"/>
-              <w:bottom w:val="single" w:color="B7B7B7" w:sz="1"/>
-              <w:right w:val="single" w:color="B7B7B7" w:sz="1"/>
-            </w:tcBorders>
-            <w:tcMar>
-              <w:top w:type="dxa" w:w="60"/>
-              <w:left w:type="dxa" w:w="70"/>
-              <w:bottom w:type="dxa" w:w="60"/>
-              <w:right w:type="dxa" w:w="70"/>
-            </w:tcMar>
-          </w:tcPr>
-          <w:p>
-            <w:r>
-              <w:rPr>
-                <w:rFonts w:ascii="Arial" w:cs="Arial" w:eastAsia="Arial" w:hAnsi="Arial"/>
-                <w:b w:val="false"/>
-                <w:bCs w:val="false"/>
-                <w:sz w:val="18"/>
-                <w:szCs w:val="18"/>
-              </w:rPr>
-              <w:t xml:space="preserve">pending</w:t>
-            </w:r>
-          </w:p>
-        </w:tc>
-      </w:tr>
-      <w:tr>
-        <w:tc>
-          <w:tcPr>
-            <w:tcW w:type="dxa" w:w="4680"/>
-            <w:tcBorders>
-              <w:top w:val="single" w:color="B7B7B7" w:sz="1"/>
-              <w:left w:val="single" w:color="B7B7B7" w:sz="1"/>
-              <w:bottom w:val="single" w:color="B7B7B7" w:sz="1"/>
-              <w:right w:val="single" w:color="B7B7B7" w:sz="1"/>
-            </w:tcBorders>
-            <w:tcMar>
-              <w:top w:type="dxa" w:w="60"/>
-              <w:left w:type="dxa" w:w="70"/>
-              <w:bottom w:type="dxa" w:w="60"/>
-              <w:right w:type="dxa" w:w="70"/>
-            </w:tcMar>
-          </w:tcPr>
-          <w:p>
-            <w:r>
-              <w:rPr>
-                <w:rFonts w:ascii="Arial" w:cs="Arial" w:eastAsia="Arial" w:hAnsi="Arial"/>
-                <w:b w:val="false"/>
-                <w:bCs w:val="false"/>
-                <w:sz w:val="18"/>
-                <w:szCs w:val="18"/>
-              </w:rPr>
-              <w:t xml:space="preserve">Validation images / instances</w:t>
+              <w:t xml:space="preserve">Development images / instances</w:t>
             </w:r>
           </w:p>
         </w:tc>
@@ -3709,7 +3675,7 @@
                 <w:sz w:val="18"/>
                 <w:szCs w:val="18"/>
               </w:rPr>
-              <w:t xml:space="preserve">RF-DETR Nano litter model</w:t>
+              <w:t xml:space="preserve">Grounding DINO Tiny public profile</w:t>
             </w:r>
           </w:p>
         </w:tc>
@@ -4065,7 +4031,7 @@
                 <w:sz w:val="18"/>
                 <w:szCs w:val="18"/>
               </w:rPr>
-              <w:t xml:space="preserve">RF-DETR Nano + class-stabilized IoU</w:t>
+              <w:t xml:space="preserve">Grounding DINO Tiny + class-stabilized IoU</w:t>
             </w:r>
           </w:p>
         </w:tc>
@@ -4482,7 +4448,7 @@
                 <w:sz w:val="18"/>
                 <w:szCs w:val="18"/>
               </w:rPr>
-              <w:t xml:space="preserve">RF-DETR Nano deployed artifact</w:t>
+              <w:t xml:space="preserve">Grounding DINO Tiny runtime</w:t>
             </w:r>
           </w:p>
         </w:tc>
@@ -4879,7 +4845,7 @@
           <w:sz w:val="22"/>
           <w:szCs w:val="22"/>
         </w:rPr>
-        <w:t xml:space="preserve">This chapter will interpret measured results against the research questions and the declared system targets. It will assess RF-DETR detection, classification, tracking, counting, and full-pipeline operation and explain failure modes. It will not infer scalability, city-wide impact, cost-effectiveness, or environmental benefit solely from laboratory detection metrics.</w:t>
+        <w:t xml:space="preserve">This chapter will interpret measured results against the research questions and the declared system targets. It will assess Grounding DINO detection, classification, tracking, counting, and full-pipeline operation and explain failure modes. It will not infer scalability, city-wide impact, cost-effectiveness, or environmental benefit solely from laboratory detection metrics.</w:t>
       </w:r>
     </w:p>
     <w:p>
@@ -4900,20 +4866,20 @@
           <w:sz w:val="22"/>
           <w:szCs w:val="22"/>
         </w:rPr>
-        <w:t xml:space="preserve">This manuscript defines a technically corrected and reproducible plan for multiclass litter detection and counting on a confirmed Jetson Orin Nano 8 GB Super device. RF-DETR Nano is the implementation model; model-family comparison is out of scope. The design integrates a portable runtime adapter, class-stabilized tracking, use-case acceptance gates, dataset leakage controls, annotation quality, hardware manifests, full-pipeline validation, privacy, security, and publication requirements.</w:t>
-      </w:r>
-    </w:p>
-    <w:p>
-      <w:pPr>
-        <w:spacing w:after="140" w:line="330"/>
-      </w:pPr>
-      <w:r>
-        <w:rPr>
-          <w:rFonts w:ascii="Arial" w:cs="Arial" w:eastAsia="Arial" w:hAnsi="Arial"/>
-          <w:sz w:val="22"/>
-          <w:szCs w:val="22"/>
-        </w:rPr>
-        <w:t xml:space="preserve">The next work is empirical: approve the data protocol, collect and label data, train RF-DETR Nano, obtain an authorized Jetson test window, export a supported artifact, run the accuracy and operational validation, and populate the Results and Discussion chapters. Until that work is complete, the project should be described as a research design and implementation scaffold rather than a validated real-time system.</w:t>
+        <w:t xml:space="preserve">This manuscript defines a technically corrected and reproducible plan for multiclass litter detection and counting on a confirmed Jetson Orin Nano 8 GB Super device. Public Grounding DINO Tiny is the implementation model; model-family comparison is out of scope. The design integrates a portable runtime adapter, class-stabilized tracking, use-case acceptance gates, dataset leakage controls, annotation quality, hardware manifests, full-pipeline validation, privacy, security, and publication requirements.</w:t>
+      </w:r>
+    </w:p>
+    <w:p>
+      <w:pPr>
+        <w:spacing w:after="140" w:line="330"/>
+      </w:pPr>
+      <w:r>
+        <w:rPr>
+          <w:rFonts w:ascii="Arial" w:cs="Arial" w:eastAsia="Arial" w:hAnsi="Arial"/>
+          <w:sz w:val="22"/>
+          <w:szCs w:val="22"/>
+        </w:rPr>
+        <w:t xml:space="preserve">The next work is empirical: approve the data protocol, collect and label evaluation data, freeze prompts and thresholds, obtain an authorized Jetson test window, run the accuracy and operational validation, and populate the Results and Discussion chapters. The reusable software is already runnable, but it must not be described as a validated real-time deployment until those measurements are complete.</w:t>
       </w:r>
     </w:p>
     <w:p>
@@ -5012,20 +4978,20 @@
           <w:sz w:val="22"/>
           <w:szCs w:val="22"/>
         </w:rPr>
-        <w:t xml:space="preserve">Roboflow. (2026). RF-DETR. https://github.com/roboflow/rf-detr</w:t>
-      </w:r>
-    </w:p>
-    <w:p>
-      <w:pPr>
-        <w:spacing w:after="140" w:line="330"/>
-      </w:pPr>
-      <w:r>
-        <w:rPr>
-          <w:rFonts w:ascii="Arial" w:cs="Arial" w:eastAsia="Arial" w:hAnsi="Arial"/>
-          <w:sz w:val="22"/>
-          <w:szCs w:val="22"/>
-        </w:rPr>
-        <w:t xml:space="preserve">Roboflow. (2026). RF-DETR export documentation. https://rfdetr.roboflow.com/latest/learn/export/</w:t>
+        <w:t xml:space="preserve">Liu, S., Zeng, Z., Ren, T., Li, F., Zhang, H., Yang, J., Jiang, Q., Li, C., Yang, J., Su, H., Zhu, J., &amp; Zhang, L. (2023). Grounding DINO: Marrying DINO with grounded pre-training for open-set object detection. arXiv:2303.05499. https://doi.org/10.48550/arXiv.2303.05499</w:t>
+      </w:r>
+    </w:p>
+    <w:p>
+      <w:pPr>
+        <w:spacing w:after="140" w:line="330"/>
+      </w:pPr>
+      <w:r>
+        <w:rPr>
+          <w:rFonts w:ascii="Arial" w:cs="Arial" w:eastAsia="Arial" w:hAnsi="Arial"/>
+          <w:sz w:val="22"/>
+          <w:szCs w:val="22"/>
+        </w:rPr>
+        <w:t xml:space="preserve">Hugging Face. (2026). Grounding DINO model documentation. https://huggingface.co/docs/transformers/model_doc/grounding-dino</w:t>
       </w:r>
     </w:p>
     <w:p>
@@ -5059,7 +5025,59 @@
           <w:sz w:val="22"/>
           <w:szCs w:val="22"/>
         </w:rPr>
-        <w:t xml:space="preserve">Training:</w:t>
+        <w:t xml:space="preserve">Inference:</w:t>
+      </w:r>
+    </w:p>
+    <w:p>
+      <w:pPr>
+        <w:spacing w:after="140" w:line="330"/>
+      </w:pPr>
+      <w:r>
+        <w:rPr>
+          <w:rFonts w:ascii="Arial" w:cs="Arial" w:eastAsia="Arial" w:hAnsi="Arial"/>
+          <w:sz w:val="22"/>
+          <w:szCs w:val="22"/>
+        </w:rPr>
+        <w:t xml:space="preserve">`./startup.sh --source 0 --max-frames 1000`</w:t>
+      </w:r>
+    </w:p>
+    <w:p>
+      <w:pPr>
+        <w:spacing w:after="140" w:line="330"/>
+      </w:pPr>
+      <w:r>
+        <w:rPr>
+          <w:rFonts w:ascii="Arial" w:cs="Arial" w:eastAsia="Arial" w:hAnsi="Arial"/>
+          <w:sz w:val="22"/>
+          <w:szCs w:val="22"/>
+        </w:rPr>
+        <w:t xml:space="preserve">Benchmark:</w:t>
+      </w:r>
+    </w:p>
+    <w:p>
+      <w:pPr>
+        <w:spacing w:after="140" w:line="330"/>
+      </w:pPr>
+      <w:r>
+        <w:rPr>
+          <w:rFonts w:ascii="Arial" w:cs="Arial" w:eastAsia="Arial" w:hAnsi="Arial"/>
+          <w:sz w:val="22"/>
+          <w:szCs w:val="22"/>
+        </w:rPr>
+        <w:t xml:space="preserve">`python benchmark.py --source data/litter/test-video.mp4 --output reports/generated/jetson-grounding-dino.json`</w:t>
+      </w:r>
+    </w:p>
+    <w:p>
+      <w:pPr>
+        <w:spacing w:after="140" w:line="330"/>
+      </w:pPr>
+      <w:r>
+        <w:rPr>
+          <w:rFonts w:ascii="Arial" w:cs="Arial" w:eastAsia="Arial" w:hAnsi="Arial"/>
+          <w:sz w:val="22"/>
+          <w:szCs w:val="22"/>
+        </w:rPr>
+        <w:t xml:space="preserve">Optional custom training:</w:t>
       </w:r>
     </w:p>
     <w:p>
@@ -5077,84 +5095,6 @@
     </w:p>
     <w:p>
       <w:pPr>
-        <w:spacing w:after="140" w:line="330"/>
-      </w:pPr>
-      <w:r>
-        <w:rPr>
-          <w:rFonts w:ascii="Arial" w:cs="Arial" w:eastAsia="Arial" w:hAnsi="Arial"/>
-          <w:sz w:val="22"/>
-          <w:szCs w:val="22"/>
-        </w:rPr>
-        <w:t xml:space="preserve">Portable ONNX export:</w:t>
-      </w:r>
-    </w:p>
-    <w:p>
-      <w:pPr>
-        <w:spacing w:after="140" w:line="330"/>
-      </w:pPr>
-      <w:r>
-        <w:rPr>
-          <w:rFonts w:ascii="Arial" w:cs="Arial" w:eastAsia="Arial" w:hAnsi="Arial"/>
-          <w:sz w:val="22"/>
-          <w:szCs w:val="22"/>
-        </w:rPr>
-        <w:t xml:space="preserve">`python export_model.py --weights runs/litter/rfdetr-nano-baseline/checkpoint_best_ema.pth --format onnx --precision fp32`</w:t>
-      </w:r>
-    </w:p>
-    <w:p>
-      <w:pPr>
-        <w:spacing w:after="140" w:line="330"/>
-      </w:pPr>
-      <w:r>
-        <w:rPr>
-          <w:rFonts w:ascii="Arial" w:cs="Arial" w:eastAsia="Arial" w:hAnsi="Arial"/>
-          <w:sz w:val="22"/>
-          <w:szCs w:val="22"/>
-        </w:rPr>
-        <w:t xml:space="preserve">Inference:</w:t>
-      </w:r>
-    </w:p>
-    <w:p>
-      <w:pPr>
-        <w:spacing w:after="140" w:line="330"/>
-      </w:pPr>
-      <w:r>
-        <w:rPr>
-          <w:rFonts w:ascii="Arial" w:cs="Arial" w:eastAsia="Arial" w:hAnsi="Arial"/>
-          <w:sz w:val="22"/>
-          <w:szCs w:val="22"/>
-        </w:rPr>
-        <w:t xml:space="preserve">`python infer.py --model models/rfdetr-nano-litter.pth --source 0 --max-frames 1000`</w:t>
-      </w:r>
-    </w:p>
-    <w:p>
-      <w:pPr>
-        <w:spacing w:after="140" w:line="330"/>
-      </w:pPr>
-      <w:r>
-        <w:rPr>
-          <w:rFonts w:ascii="Arial" w:cs="Arial" w:eastAsia="Arial" w:hAnsi="Arial"/>
-          <w:sz w:val="22"/>
-          <w:szCs w:val="22"/>
-        </w:rPr>
-        <w:t xml:space="preserve">Benchmark:</w:t>
-      </w:r>
-    </w:p>
-    <w:p>
-      <w:pPr>
-        <w:spacing w:after="140" w:line="330"/>
-      </w:pPr>
-      <w:r>
-        <w:rPr>
-          <w:rFonts w:ascii="Arial" w:cs="Arial" w:eastAsia="Arial" w:hAnsi="Arial"/>
-          <w:sz w:val="22"/>
-          <w:szCs w:val="22"/>
-        </w:rPr>
-        <w:t xml:space="preserve">`python benchmark.py --model models/rfdetr-nano-litter.pth --source data/litter/images/test --output reports/generated/jetson-rfdetr.json`</w:t>
-      </w:r>
-    </w:p>
-    <w:p>
-      <w:pPr>
         <w:pStyle w:val="Heading1"/>
       </w:pPr>
       <w:r>
@@ -5261,61 +5201,56 @@
           <w:sz w:val="22"/>
           <w:szCs w:val="22"/>
         </w:rPr>
-        <w:t xml:space="preserve">Freeze class guide, data version, and held-out split.</w:t>
-      </w:r>
-    </w:p>
-    <w:p>
-      <w:pPr>
-        <w:pStyle w:val="ListParagraph"/>
-        <w:numPr>
-          <w:ilvl w:val="0"/>
-          <w:numId w:val="3"/>
-        </w:numPr>
-        <w:spacing w:after="140" w:line="330"/>
-      </w:pPr>
-      <w:r>
-        <w:rPr>
-          <w:rFonts w:ascii="Arial" w:cs="Arial" w:eastAsia="Arial" w:hAnsi="Arial"/>
-          <w:sz w:val="22"/>
-          <w:szCs w:val="22"/>
-        </w:rPr>
-        <w:t xml:space="preserve">Train and freeze the RF-DETR Nano litter checkpoint.</w:t>
-      </w:r>
-    </w:p>
-    <w:p>
-      <w:pPr>
-        <w:pStyle w:val="ListParagraph"/>
-        <w:numPr>
-          <w:ilvl w:val="0"/>
-          <w:numId w:val="3"/>
-        </w:numPr>
-        <w:spacing w:after="140" w:line="330"/>
-      </w:pPr>
-      <w:r>
-        <w:rPr>
-          <w:rFonts w:ascii="Arial" w:cs="Arial" w:eastAsia="Arial" w:hAnsi="Arial"/>
-          <w:sz w:val="22"/>
-          <w:szCs w:val="22"/>
-        </w:rPr>
-        <w:t xml:space="preserve">Complete export, accuracy, counting, and memory acceptance gates.</w:t>
-      </w:r>
-    </w:p>
-    <w:p>
-      <w:pPr>
-        <w:pStyle w:val="ListParagraph"/>
-        <w:numPr>
-          <w:ilvl w:val="0"/>
-          <w:numId w:val="3"/>
-        </w:numPr>
-        <w:spacing w:after="140" w:line="330"/>
-      </w:pPr>
-      <w:r>
-        <w:rPr>
-          <w:rFonts w:ascii="Arial" w:cs="Arial" w:eastAsia="Arial" w:hAnsi="Arial"/>
-          <w:sz w:val="22"/>
-          <w:szCs w:val="22"/>
-        </w:rPr>
-        <w:t xml:space="preserve">Export the supported artifact and conditionally evaluate INT8.</w:t>
+        <w:t xml:space="preserve">Freeze prompt catalog, class guide, data version, and held-out split.</w:t>
+      </w:r>
+    </w:p>
+    <w:p>
+      <w:pPr>
+        <w:pStyle w:val="ListParagraph"/>
+        <w:numPr>
+          <w:ilvl w:val="0"/>
+          <w:numId w:val="3"/>
+        </w:numPr>
+        <w:spacing w:after="140" w:line="330"/>
+      </w:pPr>
+      <w:r>
+        <w:rPr>
+          <w:rFonts w:ascii="Arial" w:cs="Arial" w:eastAsia="Arial" w:hAnsi="Arial"/>
+          <w:sz w:val="22"/>
+          <w:szCs w:val="22"/>
+        </w:rPr>
+        <w:t xml:space="preserve">Complete accuracy, counting, latency, and memory acceptance gates.</w:t>
+      </w:r>
+    </w:p>
+    <w:p>
+      <w:pPr>
+        <w:pStyle w:val="ListParagraph"/>
+        <w:numPr>
+          <w:ilvl w:val="0"/>
+          <w:numId w:val="3"/>
+        </w:numPr>
+        <w:spacing w:after="140" w:line="330"/>
+      </w:pPr>
+      <w:r>
+        <w:rPr>
+          <w:rFonts w:ascii="Arial" w:cs="Arial" w:eastAsia="Arial" w:hAnsi="Arial"/>
+          <w:sz w:val="22"/>
+          <w:szCs w:val="22"/>
+        </w:rPr>
+        <w:t xml:space="preserve">Evaluate an optimized artifact only if the public reference runtime does not</w:t>
+      </w:r>
+    </w:p>
+    <w:p>
+      <w:pPr>
+        <w:spacing w:after="140" w:line="330"/>
+      </w:pPr>
+      <w:r>
+        <w:rPr>
+          <w:rFonts w:ascii="Arial" w:cs="Arial" w:eastAsia="Arial" w:hAnsi="Arial"/>
+          <w:sz w:val="22"/>
+          <w:szCs w:val="22"/>
+        </w:rPr>
+        <w:t xml:space="preserve">meet the operational target.</w:t>
       </w:r>
     </w:p>
     <w:p>

</xml_diff>

<commit_message>
Add no-training visual detector workflow
</commit_message>
<xml_diff>
--- a/thesis/Jetson_Litter_Detection_Thesis_Draft.docx
+++ b/thesis/Jetson_Litter_Detection_Thesis_Draft.docx
@@ -124,7 +124,7 @@
           <w:sz w:val="22"/>
           <w:szCs w:val="22"/>
         </w:rPr>
-        <w:t xml:space="preserve">Litter in public spaces creates environmental, social, and economic costs, yet manual inspection is difficult to sustain across large urban areas. This study proposes an edge-computing system for detecting, classifying, tracking, and counting visible litter with a public open-vocabulary detector deployed on a confirmed NVIDIA Jetson Orin Nano 8 GB Super device. The system uses Grounding DINO Tiny behind a portable runtime adapter and does not require a newly trained project checkpoint. It will be evaluated on target-domain accuracy, class recall, count error, latency, throughput, memory, power, temperature, and sustained stability. The operational configuration contains 16 configurable litter prompts covering common containers, packaging, paper, cigarette waste, organics, textiles, tires, hazardous items, and other litter. Evaluation data will be grouped by collection site and session to reduce leakage from near-duplicate video frames. Privacy controls will exclude identity analysis and minimize the capture and retention of identifiable people, vehicles, and locations. At the time of this revision, representative evaluation data and Jetson testing have not been completed. Accordingly, this manuscript presents the research motivation, design, reproducible methods, and analysis plan without claiming new accuracy or real-time performance results.</w:t>
+        <w:t xml:space="preserve">Litter in public spaces creates environmental, social, and economic costs, yet manual inspection is difficult to sustain across large urban areas. This study proposes an edge-computing system for detecting, classifying, tracking, and counting visible litter with one project-maintained RF-DETR Nano checkpoint deployed on a confirmed NVIDIA Jetson Orin Nano 8 GB Super device. Project maintainers train and publish the versioned litter checkpoint; deployment users download it automatically and do not train. The system will be evaluated on target-domain accuracy, class recall, count error, latency, throughput, memory, power, temperature, and sustained stability. The operational configuration contains 16 stable litter categories covering common containers, packaging, paper, cigarette waste, organics, textiles, tires, hazardous items, and other litter. Training and evaluation data will be grouped by original source, site, and session to reduce leakage from near-duplicate images and video frames. Privacy controls will exclude identity analysis and minimize the capture and retention of identifiable people, vehicles, and locations. At the time of this revision, representative evaluation data and Jetson testing have not been completed. Accordingly, this manuscript presents the research motivation, design, reproducible methods, and analysis plan without claiming new accuracy or real-time performance results.</w:t>
       </w:r>
     </w:p>
     <w:p>
@@ -200,20 +200,20 @@
           <w:sz w:val="22"/>
           <w:szCs w:val="22"/>
         </w:rPr>
-        <w:t xml:space="preserve">The revised system is portable and targets a confirmed NVIDIA Jetson Orin Nano Engineering Reference Developer Kit Super with 8 GB-class shared memory. The device runs JetPack 6.2.3/L4T 36.5.2 and is shared with active application and LLM services. Public Grounding DINO Tiny is the default implementation model. The reusable software separates detector inference from a standard detection schema, tracking, class stabilization, counting, SQLite persistence, human review, and fleet integration. The deployment is accepted only if it can run with enough memory headroom for media processing, evidence logging, the operating system, and the device's existing workload.</w:t>
-      </w:r>
-    </w:p>
-    <w:p>
-      <w:pPr>
-        <w:spacing w:after="140" w:line="330"/>
-      </w:pPr>
-      <w:r>
-        <w:rPr>
-          <w:rFonts w:ascii="Arial" w:cs="Arial" w:eastAsia="Arial" w:hAnsi="Arial"/>
-          <w:sz w:val="22"/>
-          <w:szCs w:val="22"/>
-        </w:rPr>
-        <w:t xml:space="preserve">No project-specific training is required for the baseline study. The Jetson is reserved for runtime validation, inference, and systems evaluation during an approved test window. Optional custom model training, if later justified by measured errors, would occur off-device. The existing project and its services will not be stopped or reconfigured for this study.</w:t>
+        <w:t xml:space="preserve">The revised system is portable and targets a confirmed NVIDIA Jetson Orin Nano Engineering Reference Developer Kit Super with 8 GB-class shared memory. The device runs JetPack 6.2.3/L4T 36.5.2 and is shared with active application and LLM services. A project-maintained RF-DETR Nano checkpoint is the selected release implementation. Grounding DINO Tiny remains a functional software bootstrap and data-review aid while that checkpoint is pending. The reusable software separates detector inference from a standard detection schema, tracking, class stabilization, counting, SQLite persistence, human review, and fleet integration. The deployment is accepted only if it can run with enough memory headroom for media processing, evidence logging, the operating system, and the device's existing workload.</w:t>
+      </w:r>
+    </w:p>
+    <w:p>
+      <w:pPr>
+        <w:spacing w:after="140" w:line="330"/>
+      </w:pPr>
+      <w:r>
+        <w:rPr>
+          <w:rFonts w:ascii="Arial" w:cs="Arial" w:eastAsia="Arial" w:hAnsi="Arial"/>
+          <w:sz w:val="22"/>
+          <w:szCs w:val="22"/>
+        </w:rPr>
+        <w:t xml:space="preserve">Training occurs centrally and off-device. It is an implementation step for one selected solution, not a comparison among model families and not a deployment requirement. The Jetson is reserved for runtime validation, inference, and systems evaluation during an approved test window. The existing project and its services will not be stopped or reconfigured for this study.</w:t>
       </w:r>
     </w:p>
     <w:p>
@@ -309,7 +309,7 @@
           <w:sz w:val="22"/>
           <w:szCs w:val="22"/>
         </w:rPr>
-        <w:t xml:space="preserve">Prevent configuration-test leakage by grouping prompt-development and test</w:t>
+        <w:t xml:space="preserve">Prevent configuration-test leakage by grouping training, validation, and test</w:t>
       </w:r>
     </w:p>
     <w:p>
@@ -358,20 +358,20 @@
           <w:sz w:val="22"/>
           <w:szCs w:val="22"/>
         </w:rPr>
-        <w:t xml:space="preserve">Configure and freeze the public Grounding DINO Tiny prompt catalog and</w:t>
-      </w:r>
-    </w:p>
-    <w:p>
-      <w:pPr>
-        <w:spacing w:after="140" w:line="330"/>
-      </w:pPr>
-      <w:r>
-        <w:rPr>
-          <w:rFonts w:ascii="Arial" w:cs="Arial" w:eastAsia="Arial" w:hAnsi="Arial"/>
-          <w:sz w:val="22"/>
-          <w:szCs w:val="22"/>
-        </w:rPr>
-        <w:t xml:space="preserve">thresholds without training a new checkpoint.</w:t>
+        <w:t xml:space="preserve">Prepare a grouped, attributed TACO bootstrap dataset and add representative</w:t>
+      </w:r>
+    </w:p>
+    <w:p>
+      <w:pPr>
+        <w:spacing w:after="140" w:line="330"/>
+      </w:pPr>
+      <w:r>
+        <w:rPr>
+          <w:rFonts w:ascii="Arial" w:cs="Arial" w:eastAsia="Arial" w:hAnsi="Arial"/>
+          <w:sz w:val="22"/>
+          <w:szCs w:val="22"/>
+        </w:rPr>
+        <w:t xml:space="preserve">target-domain training data.</w:t>
       </w:r>
     </w:p>
     <w:p>
@@ -389,6 +389,37 @@
           <w:sz w:val="22"/>
           <w:szCs w:val="22"/>
         </w:rPr>
+        <w:t xml:space="preserve">Train and freeze one RF-DETR Nano litter checkpoint, class schema, and</w:t>
+      </w:r>
+    </w:p>
+    <w:p>
+      <w:pPr>
+        <w:spacing w:after="140" w:line="330"/>
+      </w:pPr>
+      <w:r>
+        <w:rPr>
+          <w:rFonts w:ascii="Arial" w:cs="Arial" w:eastAsia="Arial" w:hAnsi="Arial"/>
+          <w:sz w:val="22"/>
+          <w:szCs w:val="22"/>
+        </w:rPr>
+        <w:t xml:space="preserve">thresholds off-device.</w:t>
+      </w:r>
+    </w:p>
+    <w:p>
+      <w:pPr>
+        <w:pStyle w:val="ListParagraph"/>
+        <w:numPr>
+          <w:ilvl w:val="0"/>
+          <w:numId w:val="2"/>
+        </w:numPr>
+        <w:spacing w:after="140" w:line="330"/>
+      </w:pPr>
+      <w:r>
+        <w:rPr>
+          <w:rFonts w:ascii="Arial" w:cs="Arial" w:eastAsia="Arial" w:hAnsi="Arial"/>
+          <w:sz w:val="22"/>
+          <w:szCs w:val="22"/>
+        </w:rPr>
         <w:t xml:space="preserve">Validate the intended runtime on the target Jetson.</w:t>
       </w:r>
     </w:p>
@@ -407,20 +438,20 @@
           <w:sz w:val="22"/>
           <w:szCs w:val="22"/>
         </w:rPr>
-        <w:t xml:space="preserve">Treat model export or custom training as optional optimization only when</w:t>
-      </w:r>
-    </w:p>
-    <w:p>
-      <w:pPr>
-        <w:spacing w:after="140" w:line="330"/>
-      </w:pPr>
-      <w:r>
-        <w:rPr>
-          <w:rFonts w:ascii="Arial" w:cs="Arial" w:eastAsia="Arial" w:hAnsi="Arial"/>
-          <w:sz w:val="22"/>
-          <w:szCs w:val="22"/>
-        </w:rPr>
-        <w:t xml:space="preserve">baseline measurements justify it.</w:t>
+        <w:t xml:space="preserve">Measure accuracy, count error, latency, throughput, memory, power,</w:t>
+      </w:r>
+    </w:p>
+    <w:p>
+      <w:pPr>
+        <w:spacing w:after="140" w:line="330"/>
+      </w:pPr>
+      <w:r>
+        <w:rPr>
+          <w:rFonts w:ascii="Arial" w:cs="Arial" w:eastAsia="Arial" w:hAnsi="Arial"/>
+          <w:sz w:val="22"/>
+          <w:szCs w:val="22"/>
+        </w:rPr>
+        <w:t xml:space="preserve">temperature, and sustained-run stability.</w:t>
       </w:r>
     </w:p>
     <w:p>
@@ -438,20 +469,20 @@
           <w:sz w:val="22"/>
           <w:szCs w:val="22"/>
         </w:rPr>
-        <w:t xml:space="preserve">Measure accuracy, count error, latency, throughput, memory, power,</w:t>
-      </w:r>
-    </w:p>
-    <w:p>
-      <w:pPr>
-        <w:spacing w:after="140" w:line="330"/>
-      </w:pPr>
-      <w:r>
-        <w:rPr>
-          <w:rFonts w:ascii="Arial" w:cs="Arial" w:eastAsia="Arial" w:hAnsi="Arial"/>
-          <w:sz w:val="22"/>
-          <w:szCs w:val="22"/>
-        </w:rPr>
-        <w:t xml:space="preserve">temperature, and sustained-run stability.</w:t>
+        <w:t xml:space="preserve">Analyze detection and counting failures by class, object size, lighting,</w:t>
+      </w:r>
+    </w:p>
+    <w:p>
+      <w:pPr>
+        <w:spacing w:after="140" w:line="330"/>
+      </w:pPr>
+      <w:r>
+        <w:rPr>
+          <w:rFonts w:ascii="Arial" w:cs="Arial" w:eastAsia="Arial" w:hAnsi="Arial"/>
+          <w:sz w:val="22"/>
+          <w:szCs w:val="22"/>
+        </w:rPr>
+        <w:t xml:space="preserve">weather, occlusion, and scene type.</w:t>
       </w:r>
     </w:p>
     <w:p>
@@ -469,37 +500,6 @@
           <w:sz w:val="22"/>
           <w:szCs w:val="22"/>
         </w:rPr>
-        <w:t xml:space="preserve">Analyze detection and counting failures by class, object size, lighting,</w:t>
-      </w:r>
-    </w:p>
-    <w:p>
-      <w:pPr>
-        <w:spacing w:after="140" w:line="330"/>
-      </w:pPr>
-      <w:r>
-        <w:rPr>
-          <w:rFonts w:ascii="Arial" w:cs="Arial" w:eastAsia="Arial" w:hAnsi="Arial"/>
-          <w:sz w:val="22"/>
-          <w:szCs w:val="22"/>
-        </w:rPr>
-        <w:t xml:space="preserve">weather, occlusion, and scene type.</w:t>
-      </w:r>
-    </w:p>
-    <w:p>
-      <w:pPr>
-        <w:pStyle w:val="ListParagraph"/>
-        <w:numPr>
-          <w:ilvl w:val="0"/>
-          <w:numId w:val="2"/>
-        </w:numPr>
-        <w:spacing w:after="140" w:line="330"/>
-      </w:pPr>
-      <w:r>
-        <w:rPr>
-          <w:rFonts w:ascii="Arial" w:cs="Arial" w:eastAsia="Arial" w:hAnsi="Arial"/>
-          <w:sz w:val="22"/>
-          <w:szCs w:val="22"/>
-        </w:rPr>
         <w:t xml:space="preserve">Publish reusable code, model documentation, citations, and—where licensing</w:t>
       </w:r>
     </w:p>
@@ -539,51 +539,51 @@
           <w:sz w:val="22"/>
           <w:szCs w:val="22"/>
         </w:rPr>
-        <w:t xml:space="preserve">RQ1: How accurately does the Grounding DINO Tiny implementation detect and classify</w:t>
-      </w:r>
-    </w:p>
-    <w:p>
-      <w:pPr>
-        <w:spacing w:after="140" w:line="330"/>
-      </w:pPr>
-      <w:r>
-        <w:rPr>
-          <w:rFonts w:ascii="Arial" w:cs="Arial" w:eastAsia="Arial" w:hAnsi="Arial"/>
-          <w:sz w:val="22"/>
-          <w:szCs w:val="22"/>
-        </w:rPr>
-        <w:t xml:space="preserve">litter on a held-out, target-representative test set?</w:t>
-      </w:r>
-    </w:p>
-    <w:p>
-      <w:pPr>
-        <w:pStyle w:val="ListParagraph"/>
-        <w:numPr>
-          <w:ilvl w:val="0"/>
-          <w:numId w:val="3"/>
-        </w:numPr>
-        <w:spacing w:after="140" w:line="330"/>
-      </w:pPr>
-      <w:r>
-        <w:rPr>
-          <w:rFonts w:ascii="Arial" w:cs="Arial" w:eastAsia="Arial" w:hAnsi="Arial"/>
-          <w:sz w:val="22"/>
-          <w:szCs w:val="22"/>
-        </w:rPr>
-        <w:t xml:space="preserve">RQ2: Does the exported edge artifact preserve acceptable detection and</w:t>
-      </w:r>
-    </w:p>
-    <w:p>
-      <w:pPr>
-        <w:spacing w:after="140" w:line="330"/>
-      </w:pPr>
-      <w:r>
-        <w:rPr>
-          <w:rFonts w:ascii="Arial" w:cs="Arial" w:eastAsia="Arial" w:hAnsi="Arial"/>
-          <w:sz w:val="22"/>
-          <w:szCs w:val="22"/>
-        </w:rPr>
-        <w:t xml:space="preserve">classification accuracy?</w:t>
+        <w:t xml:space="preserve">RQ1: How accurately does the selected RF-DETR Nano litter implementation</w:t>
+      </w:r>
+    </w:p>
+    <w:p>
+      <w:pPr>
+        <w:spacing w:after="140" w:line="330"/>
+      </w:pPr>
+      <w:r>
+        <w:rPr>
+          <w:rFonts w:ascii="Arial" w:cs="Arial" w:eastAsia="Arial" w:hAnsi="Arial"/>
+          <w:sz w:val="22"/>
+          <w:szCs w:val="22"/>
+        </w:rPr>
+        <w:t xml:space="preserve">detect and classify litter on a held-out, target-representative test set?</w:t>
+      </w:r>
+    </w:p>
+    <w:p>
+      <w:pPr>
+        <w:pStyle w:val="ListParagraph"/>
+        <w:numPr>
+          <w:ilvl w:val="0"/>
+          <w:numId w:val="3"/>
+        </w:numPr>
+        <w:spacing w:after="140" w:line="330"/>
+      </w:pPr>
+      <w:r>
+        <w:rPr>
+          <w:rFonts w:ascii="Arial" w:cs="Arial" w:eastAsia="Arial" w:hAnsi="Arial"/>
+          <w:sz w:val="22"/>
+          <w:szCs w:val="22"/>
+        </w:rPr>
+        <w:t xml:space="preserve">RQ2: Does the selected edge runtime preserve acceptable detection and</w:t>
+      </w:r>
+    </w:p>
+    <w:p>
+      <w:pPr>
+        <w:spacing w:after="140" w:line="330"/>
+      </w:pPr>
+      <w:r>
+        <w:rPr>
+          <w:rFonts w:ascii="Arial" w:cs="Arial" w:eastAsia="Arial" w:hAnsi="Arial"/>
+          <w:sz w:val="22"/>
+          <w:szCs w:val="22"/>
+        </w:rPr>
+        <w:t xml:space="preserve">classification accuracy from the frozen checkpoint?</w:t>
       </w:r>
     </w:p>
     <w:p>
@@ -697,7 +697,7 @@
           <w:sz w:val="22"/>
           <w:szCs w:val="22"/>
         </w:rPr>
-        <w:t xml:space="preserve">The intended contribution is not a new neural-network architecture. It is a well-documented applied study that connects a public reusable detector, configurable open-vocabulary categories, dataset governance, reusable hardware adapters, tracking-based counting, Jetson validation, systems benchmarking, privacy constraints, and honest publication of limitations. The repository is designed so that the application works before study results exist and the final claims can be traced to machine-readable evidence.</w:t>
+        <w:t xml:space="preserve">The intended contribution is not a new neural-network architecture. It is a well-documented applied study that connects a publicly downloadable litter-specific detector, dataset governance, reusable hardware adapters, tracking-based counting, Jetson validation, systems benchmarking, privacy constraints, and honest publication of limitations. The repository is designed so that the complete application can be exercised with a bootstrap model before the selected checkpoint is released and the final claims can be traced to machine-readable evidence.</w:t>
       </w:r>
     </w:p>
     <w:p>
@@ -799,7 +799,20 @@
           <w:sz w:val="22"/>
           <w:szCs w:val="22"/>
         </w:rPr>
-        <w:t xml:space="preserve">Grounding DINO Tiny is the selected public implementation. Grounding DINO is an open-set detector that can detect objects described by text prompts. This supports an operational catalog that can be revised without training a new fixed-class output layer. Its Jetson candidacy remains conditional on stable execution on the exact target stack with acceptable accuracy, latency, and memory use. RF-DETR remains an optional future closed-set specialization, not the baseline requirement.</w:t>
+        <w:t xml:space="preserve">RF-DETR Nano is the selected release architecture for this study. It provides a fixed output taxonomy suitable for versioned operational interfaces and supports deployment-oriented export. A project-maintained checkpoint will be trained centrally from licensed litter data and published for automatic download after validation. This choice defines the implementation to evaluate; the thesis does not compare RF-DETR against YOLO, Grounding DINO, or other families.</w:t>
+      </w:r>
+    </w:p>
+    <w:p>
+      <w:pPr>
+        <w:spacing w:after="140" w:line="330"/>
+      </w:pPr>
+      <w:r>
+        <w:rPr>
+          <w:rFonts w:ascii="Arial" w:cs="Arial" w:eastAsia="Arial" w:hAnsi="Arial"/>
+          <w:sz w:val="22"/>
+          <w:szCs w:val="22"/>
+        </w:rPr>
+        <w:t xml:space="preserve">Grounding DINO is an open-set detector that can locate objects described by text prompts. It is used only as a functional software bootstrap and possible data-review aid while the litter-specific checkpoint is pending. Its outputs are not treated as the final system's accuracy evidence. OmDet-Turbo Tiny is also integrated as a compact, confidence-scored no-training engineering screen. Neither open-vocabulary backend is a competing thesis model; only a configuration that passes the declared gates can be frozen for evaluation.</w:t>
       </w:r>
     </w:p>
     <w:p>
@@ -1360,7 +1373,7 @@
           <w:sz w:val="22"/>
           <w:szCs w:val="22"/>
         </w:rPr>
-        <w:t xml:space="preserve">download/cache the public model automatically and fail clearly when required</w:t>
+        <w:t xml:space="preserve">download/cache the published model automatically and fail clearly when required</w:t>
       </w:r>
     </w:p>
     <w:p>
@@ -1412,7 +1425,7 @@
           <w:sz w:val="22"/>
           <w:szCs w:val="22"/>
         </w:rPr>
-        <w:t xml:space="preserve">The runtime path is camera or media input, Grounding DINO preprocessing, a public detector runtime, standard detection records, class-stabilized tracking, counting, and local event handling. It reports current visible objects separately from unique confirmed track IDs encountered during the session. Evidence is written as streaming JSON Lines plus an end-of-run summary. An offline SQLite store retains run metadata, per-frame count snapshots, optional detections, human-review tasks, explicit collection confirmations, and durable events for a fleet connector. Vehicle, route, and edge-device identifiers make the records usable by a larger truck platform.</w:t>
+        <w:t xml:space="preserve">The runtime path is camera or media input, selected detector preprocessing, a versioned detector runtime, standard detection records, class-stabilized tracking, counting, and local event handling. It reports current visible objects separately from unique confirmed track IDs encountered during the session. Evidence is written as streaming JSON Lines plus an end-of-run summary. An offline SQLite store retains run metadata, per-frame count snapshots, optional detections, human-review tasks, explicit collection confirmations, and durable events for a fleet connector. Vehicle, route, and edge-device identifiers make the records usable by a larger truck platform.</w:t>
       </w:r>
     </w:p>
     <w:p>
@@ -1438,20 +1451,20 @@
           <w:sz w:val="22"/>
           <w:szCs w:val="22"/>
         </w:rPr>
-        <w:t xml:space="preserve">The reusable software is a deliverable separate from this manuscript. Its `startup.sh` entry point automates environment preparation, public-model download and caching, source discovery, inference, and timestamped evidence output. The thesis will cite the exact public Git commit and artifact checksums used for each experiment; the software does not require the thesis in order to run.</w:t>
-      </w:r>
-    </w:p>
-    <w:p>
-      <w:pPr>
-        <w:spacing w:after="140" w:line="330"/>
-      </w:pPr>
-      <w:r>
-        <w:rPr>
-          <w:rFonts w:ascii="Arial" w:cs="Arial" w:eastAsia="Arial" w:hAnsi="Arial"/>
-          <w:sz w:val="22"/>
-          <w:szCs w:val="22"/>
-        </w:rPr>
-        <w:t xml:space="preserve">The baseline uses a public checkpoint and versioned prompts rather than a new training run. Each CPU, NVIDIA, AMD, or Jetson deployment retains its own manifest containing the model identifier, configuration, software versions, device details, and any optimized artifact checksum. Evidence from one device is not generalized to another.</w:t>
+        <w:t xml:space="preserve">The reusable software is a deliverable separate from this manuscript. Its `startup.sh` entry point automates environment preparation, model download and checksum verification, source discovery, inference, and timestamped evidence output. The thesis will cite the exact public Git commit and artifact checksums used for each experiment; the software does not require the thesis in order to run.</w:t>
+      </w:r>
+    </w:p>
+    <w:p>
+      <w:pPr>
+        <w:spacing w:after="140" w:line="330"/>
+      </w:pPr>
+      <w:r>
+        <w:rPr>
+          <w:rFonts w:ascii="Arial" w:cs="Arial" w:eastAsia="Arial" w:hAnsi="Arial"/>
+          <w:sz w:val="22"/>
+          <w:szCs w:val="22"/>
+        </w:rPr>
+        <w:t xml:space="preserve">The implementation uses a centrally trained, public checkpoint with a versioned fixed taxonomy. Each CPU, NVIDIA, AMD, or Jetson deployment retains its own manifest containing the model identifier and checksum, configuration, software versions, device details, and any optimized artifact checksum. Evidence from one device is not generalized to another.</w:t>
       </w:r>
     </w:p>
     <w:p>
@@ -1472,7 +1485,7 @@
           <w:sz w:val="22"/>
           <w:szCs w:val="22"/>
         </w:rPr>
-        <w:t xml:space="preserve">Grounding DINO Tiny is accepted for the use case only if it loads with sufficient memory headroom, completes representative media without unsupported operators or crashes, and meets the frozen detection, classification, and counting accuracy requirements. An optimized runtime artifact is optional, but must preserve acceptable output if used.</w:t>
+        <w:t xml:space="preserve">The RF-DETR Nano litter checkpoint is accepted for the use case only if it loads with sufficient memory headroom, completes representative media without unsupported operators or crashes, and meets the frozen detection, classification, and counting accuracy requirements. Any selected optimized runtime artifact must preserve acceptable output.</w:t>
       </w:r>
     </w:p>
     <w:p>
@@ -1540,7 +1553,7 @@
           <w:sz w:val="22"/>
           <w:szCs w:val="22"/>
         </w:rPr>
-        <w:t xml:space="preserve">The study is an empirical design-and-evaluation project. It combines controlled prompt and threshold configuration with measurement of an implemented edge system. Prompt and threshold selection will use development data; the held-out test set will be used only after configuration choices are frozen.</w:t>
+        <w:t xml:space="preserve">The study is an empirical design-and-evaluation project. It combines central training of one selected litter detector with measurement of the complete edge system. Model and threshold decisions will use training and validation data; the held-out test set will be used only after configuration choices are frozen.</w:t>
       </w:r>
     </w:p>
     <w:p>
@@ -1561,7 +1574,7 @@
           <w:sz w:val="22"/>
           <w:szCs w:val="22"/>
         </w:rPr>
-        <w:t xml:space="preserve">The dataset will combine licensed public litter imagery with target-domain camera data. A source inventory will record dataset version, license, attribution, image count, annotation format, download date, and redistribution restrictions.</w:t>
+        <w:t xml:space="preserve">The dataset will combine an automatically prepared TACO bootstrap with target-domain camera data. The preparation command retains source URLs, licenses, annotations, image checksums, label mappings, and deterministic source-group splits. A source inventory will record dataset version, license, attribution, image count, annotation format, download date, and redistribution restrictions.</w:t>
       </w:r>
     </w:p>
     <w:p>
@@ -1595,7 +1608,7 @@
           <w:sz w:val="22"/>
           <w:szCs w:val="22"/>
         </w:rPr>
-        <w:t xml:space="preserve">The operational catalog begins with 16 categories: plastic bottle, glass bottle, metal can, paper, cardboard, plastic bag, food wrapper, disposable cup, cigarette butt, food waste, textile, tire, battery, electronic waste, broken glass, and other litter. The prompts can be revised without retraining, but the stable output schema will be versioned. A labeling review will test whether these categories can be applied consistently. If material cannot be inferred reliably, the system will prefer an ambiguous/manual-review outcome.</w:t>
+        <w:t xml:space="preserve">The operational catalog begins with 16 categories: plastic bottle, glass bottle, metal can, paper, cardboard, plastic bag, food wrapper, disposable cup, cigarette butt, food waste, textile, tire, battery, electronic waste, broken glass, and other litter. The fixed output schema will be versioned with the checkpoint. A labeling review will test whether these categories can be applied consistently. If material cannot be inferred reliably, the system will prefer an ambiguous/manual-review outcome.</w:t>
       </w:r>
     </w:p>
     <w:p>
@@ -1758,20 +1771,20 @@
           <w:sz w:val="22"/>
           <w:szCs w:val="22"/>
         </w:rPr>
-        <w:t xml:space="preserve">Adjacent video frames and repeated views of the same scene are highly correlated. Random image-level splitting can place nearly identical content in prompt-development and test sets and inflate performance. The data will therefore be grouped by collection site, session, or source video before assignment to development and held-out test partitions.</w:t>
-      </w:r>
-    </w:p>
-    <w:p>
-      <w:pPr>
-        <w:spacing w:after="140" w:line="330"/>
-      </w:pPr>
-      <w:r>
-        <w:rPr>
-          <w:rFonts w:ascii="Arial" w:cs="Arial" w:eastAsia="Arial" w:hAnsi="Arial"/>
-          <w:sz w:val="22"/>
-          <w:szCs w:val="22"/>
-        </w:rPr>
-        <w:t xml:space="preserve">A grouped development/test split will be chosen after the source inventory is known and before prompt tuning. The test partition will be frozen and checksummed before final accuracy evaluation.</w:t>
+        <w:t xml:space="preserve">Adjacent video frames and repeated views of the same scene are highly correlated. Random image-level splitting can place nearly identical content in training, validation, and test sets and inflate performance. The data will therefore be grouped by collection site, session, or source video before assignment to training, validation, and held-out test partitions.</w:t>
+      </w:r>
+    </w:p>
+    <w:p>
+      <w:pPr>
+        <w:spacing w:after="140" w:line="330"/>
+      </w:pPr>
+      <w:r>
+        <w:rPr>
+          <w:rFonts w:ascii="Arial" w:cs="Arial" w:eastAsia="Arial" w:hAnsi="Arial"/>
+          <w:sz w:val="22"/>
+          <w:szCs w:val="22"/>
+        </w:rPr>
+        <w:t xml:space="preserve">A grouped split will be chosen after the source inventory is known and before model and threshold decisions. The test partition will be frozen and checksummed before final accuracy evaluation.</w:t>
       </w:r>
     </w:p>
     <w:p>
@@ -1779,33 +1792,33 @@
         <w:pStyle w:val="Heading2"/>
       </w:pPr>
       <w:r>
-        <w:t xml:space="preserve">4.6 Public-model configuration</w:t>
-      </w:r>
-    </w:p>
-    <w:p>
-      <w:pPr>
-        <w:spacing w:after="140" w:line="330"/>
-      </w:pPr>
-      <w:r>
-        <w:rPr>
-          <w:rFonts w:ascii="Arial" w:cs="Arial" w:eastAsia="Arial" w:hAnsi="Arial"/>
-          <w:sz w:val="22"/>
-          <w:szCs w:val="22"/>
-        </w:rPr>
-        <w:t xml:space="preserve">The baseline will use the public `IDEA-Research/grounding-dino-tiny` checkpoint. The versioned prompt catalog, confidence threshold, non-maximum-suppression threshold, package versions, Git revision, and model source will be retained in the run artifacts.</w:t>
-      </w:r>
-    </w:p>
-    <w:p>
-      <w:pPr>
-        <w:spacing w:after="140" w:line="330"/>
-      </w:pPr>
-      <w:r>
-        <w:rPr>
-          <w:rFonts w:ascii="Arial" w:cs="Arial" w:eastAsia="Arial" w:hAnsi="Arial"/>
-          <w:sz w:val="22"/>
-          <w:szCs w:val="22"/>
-        </w:rPr>
-        <w:t xml:space="preserve">Prompt and threshold refinement, if performed, will use development data only. The scope of those changes will be disclosed. The held-out test set will not be used to select prompts, image size, confidence threshold, or review policy. Custom training is outside the baseline and will be undertaken only if measured deployment errors justify a separate specialized profile.</w:t>
+        <w:t xml:space="preserve">4.6 Model training and configuration</w:t>
+      </w:r>
+    </w:p>
+    <w:p>
+      <w:pPr>
+        <w:spacing w:after="140" w:line="330"/>
+      </w:pPr>
+      <w:r>
+        <w:rPr>
+          <w:rFonts w:ascii="Arial" w:cs="Arial" w:eastAsia="Arial" w:hAnsi="Arial"/>
+          <w:sz w:val="22"/>
+          <w:szCs w:val="22"/>
+        </w:rPr>
+        <w:t xml:space="preserve">The selected implementation will fine-tune one RF-DETR Nano checkpoint off-device. Training data, class schema, hyperparameters, package versions, Git revision, base model, output checkpoint, and checksums will be retained in machine-readable manifests.</w:t>
+      </w:r>
+    </w:p>
+    <w:p>
+      <w:pPr>
+        <w:spacing w:after="140" w:line="330"/>
+      </w:pPr>
+      <w:r>
+        <w:rPr>
+          <w:rFonts w:ascii="Arial" w:cs="Arial" w:eastAsia="Arial" w:hAnsi="Arial"/>
+          <w:sz w:val="22"/>
+          <w:szCs w:val="22"/>
+        </w:rPr>
+        <w:t xml:space="preserve">Checkpoint and threshold selection will use training and validation data only. The held-out test set will not be used to select a checkpoint, image size, confidence threshold, or review policy. Classes without training and held-out support will block release or be removed from the published taxonomy.</w:t>
       </w:r>
     </w:p>
     <w:p>
@@ -1813,20 +1826,20 @@
         <w:pStyle w:val="Heading2"/>
       </w:pPr>
       <w:r>
-        <w:t xml:space="preserve">4.7 Runtime and optional optimization</w:t>
-      </w:r>
-    </w:p>
-    <w:p>
-      <w:pPr>
-        <w:spacing w:after="140" w:line="330"/>
-      </w:pPr>
-      <w:r>
-        <w:rPr>
-          <w:rFonts w:ascii="Arial" w:cs="Arial" w:eastAsia="Arial" w:hAnsi="Arial"/>
-          <w:sz w:val="22"/>
-          <w:szCs w:val="22"/>
-        </w:rPr>
-        <w:t xml:space="preserve">The public model will be evaluated first through a JetPack-compatible runtime without modifying the shared Jetson. If a target-specific export or optimized platform service is later required, its source model, format, precision, input shape, software versions, and checksum will be recorded.</w:t>
+        <w:t xml:space="preserve">4.7 Runtime and export</w:t>
+      </w:r>
+    </w:p>
+    <w:p>
+      <w:pPr>
+        <w:spacing w:after="140" w:line="330"/>
+      </w:pPr>
+      <w:r>
+        <w:rPr>
+          <w:rFonts w:ascii="Arial" w:cs="Arial" w:eastAsia="Arial" w:hAnsi="Arial"/>
+          <w:sz w:val="22"/>
+          <w:szCs w:val="22"/>
+        </w:rPr>
+        <w:t xml:space="preserve">The selected checkpoint will be evaluated through a JetPack-compatible runtime without modifying the shared Jetson. The chosen target-specific export or runtime will record its source checkpoint, format, precision, input shape, software versions, and checksum.</w:t>
       </w:r>
     </w:p>
     <w:p>
@@ -2281,7 +2294,7 @@
           <w:sz w:val="22"/>
           <w:szCs w:val="22"/>
         </w:rPr>
-        <w:t xml:space="preserve">Edge processing avoids continuous transmission of raw video but still consumes energy and hardware. The study will report power and energy-per-frame evidence where feasible. The selected runtime and prompt catalog will remain only as complex as required by the use-case accuracy target. Custom training will not be introduced unless measured errors show that the public baseline is insufficient.</w:t>
+        <w:t xml:space="preserve">Edge processing avoids continuous transmission of raw video but still consumes energy and hardware. The study will report power and energy-per-frame evidence where feasible. The selected runtime and fixed taxonomy will remain only as complex as required by the use-case accuracy target. Central training and export work will be documented so their compute cost is not hidden.</w:t>
       </w:r>
     </w:p>
     <w:p>
@@ -2302,7 +2315,7 @@
           <w:sz w:val="22"/>
           <w:szCs w:val="22"/>
         </w:rPr>
-        <w:t xml:space="preserve">No representative evaluation dataset or Jetson benchmark has been completed for this revised study. A read-only hardware inventory and runnable public-model software implementation have been completed; neither is a model-performance result. The remaining tables are templates and must not be read as results.</w:t>
+        <w:t xml:space="preserve">No representative target-domain dataset or Jetson benchmark has been completed for this revised study. A read-only hardware inventory, runnable bootstrap software, and automated TACO preparation path have been completed; none is a final model-performance result. The remaining tables are templates and must not be read as results.</w:t>
       </w:r>
     </w:p>
     <w:p>
@@ -3675,7 +3688,7 @@
                 <w:sz w:val="18"/>
                 <w:szCs w:val="18"/>
               </w:rPr>
-              <w:t xml:space="preserve">Grounding DINO Tiny public profile</w:t>
+              <w:t xml:space="preserve">RF-DETR Nano litter release candidate</w:t>
             </w:r>
           </w:p>
         </w:tc>
@@ -4031,7 +4044,7 @@
                 <w:sz w:val="18"/>
                 <w:szCs w:val="18"/>
               </w:rPr>
-              <w:t xml:space="preserve">Grounding DINO Tiny + class-stabilized IoU</w:t>
+              <w:t xml:space="preserve">RF-DETR Nano + class-stabilized IoU</w:t>
             </w:r>
           </w:p>
         </w:tc>
@@ -4448,7 +4461,7 @@
                 <w:sz w:val="18"/>
                 <w:szCs w:val="18"/>
               </w:rPr>
-              <w:t xml:space="preserve">Grounding DINO Tiny runtime</w:t>
+              <w:t xml:space="preserve">RF-DETR Nano selected runtime</w:t>
             </w:r>
           </w:p>
         </w:tc>
@@ -4845,7 +4858,7 @@
           <w:sz w:val="22"/>
           <w:szCs w:val="22"/>
         </w:rPr>
-        <w:t xml:space="preserve">This chapter will interpret measured results against the research questions and the declared system targets. It will assess Grounding DINO detection, classification, tracking, counting, and full-pipeline operation and explain failure modes. It will not infer scalability, city-wide impact, cost-effectiveness, or environmental benefit solely from laboratory detection metrics.</w:t>
+        <w:t xml:space="preserve">This chapter will interpret measured results against the research questions and the declared system targets. It will assess the selected RF-DETR litter checkpoint's detection, classification, tracking, counting, and full-pipeline operation and explain failure modes. It will not infer scalability, city-wide impact, cost-effectiveness, or environmental benefit solely from laboratory detection metrics.</w:t>
       </w:r>
     </w:p>
     <w:p>
@@ -4866,20 +4879,20 @@
           <w:sz w:val="22"/>
           <w:szCs w:val="22"/>
         </w:rPr>
-        <w:t xml:space="preserve">This manuscript defines a technically corrected and reproducible plan for multiclass litter detection and counting on a confirmed Jetson Orin Nano 8 GB Super device. Public Grounding DINO Tiny is the implementation model; model-family comparison is out of scope. The design integrates a portable runtime adapter, class-stabilized tracking, use-case acceptance gates, dataset leakage controls, annotation quality, hardware manifests, full-pipeline validation, privacy, security, and publication requirements.</w:t>
-      </w:r>
-    </w:p>
-    <w:p>
-      <w:pPr>
-        <w:spacing w:after="140" w:line="330"/>
-      </w:pPr>
-      <w:r>
-        <w:rPr>
-          <w:rFonts w:ascii="Arial" w:cs="Arial" w:eastAsia="Arial" w:hAnsi="Arial"/>
-          <w:sz w:val="22"/>
-          <w:szCs w:val="22"/>
-        </w:rPr>
-        <w:t xml:space="preserve">The next work is empirical: approve the data protocol, collect and label evaluation data, freeze prompts and thresholds, obtain an authorized Jetson test window, run the accuracy and operational validation, and populate the Results and Discussion chapters. The reusable software is already runnable, but it must not be described as a validated real-time deployment until those measurements are complete.</w:t>
+        <w:t xml:space="preserve">This manuscript defines a technically corrected and reproducible plan for multiclass litter detection and counting on a confirmed Jetson Orin Nano 8 GB Super device. A project-maintained RF-DETR Nano checkpoint is the selected implementation; model-family comparison is out of scope. The design integrates a portable runtime adapter, class-stabilized tracking, use-case acceptance gates, dataset leakage controls, annotation quality, hardware manifests, full-pipeline validation, privacy, security, and publication requirements.</w:t>
+      </w:r>
+    </w:p>
+    <w:p>
+      <w:pPr>
+        <w:spacing w:after="140" w:line="330"/>
+      </w:pPr>
+      <w:r>
+        <w:rPr>
+          <w:rFonts w:ascii="Arial" w:cs="Arial" w:eastAsia="Arial" w:hAnsi="Arial"/>
+          <w:sz w:val="22"/>
+          <w:szCs w:val="22"/>
+        </w:rPr>
+        <w:t xml:space="preserve">The next work is empirical: approve the data protocol, prepare TACO, collect and label representative field data, train and freeze the checkpoint and thresholds, obtain an authorized Jetson test window, run the accuracy and operational validation, and populate the Results and Discussion chapters. The reusable software is already runnable with its bootstrap, but the release model must not be described as a validated real-time deployment until those measurements are complete.</w:t>
       </w:r>
     </w:p>
     <w:p>
@@ -5064,33 +5077,46 @@
           <w:sz w:val="22"/>
           <w:szCs w:val="22"/>
         </w:rPr>
-        <w:t xml:space="preserve">`python benchmark.py --source data/litter/test-video.mp4 --output reports/generated/jetson-grounding-dino.json`</w:t>
-      </w:r>
-    </w:p>
-    <w:p>
-      <w:pPr>
-        <w:spacing w:after="140" w:line="330"/>
-      </w:pPr>
-      <w:r>
-        <w:rPr>
-          <w:rFonts w:ascii="Arial" w:cs="Arial" w:eastAsia="Arial" w:hAnsi="Arial"/>
-          <w:sz w:val="22"/>
-          <w:szCs w:val="22"/>
-        </w:rPr>
-        <w:t xml:space="preserve">Optional custom training:</w:t>
-      </w:r>
-    </w:p>
-    <w:p>
-      <w:pPr>
-        <w:spacing w:after="140" w:line="330"/>
-      </w:pPr>
-      <w:r>
-        <w:rPr>
-          <w:rFonts w:ascii="Arial" w:cs="Arial" w:eastAsia="Arial" w:hAnsi="Arial"/>
-          <w:sz w:val="22"/>
-          <w:szCs w:val="22"/>
-        </w:rPr>
-        <w:t xml:space="preserve">`python train.py --data data/litter --model rfdetr-nano`</w:t>
+        <w:t xml:space="preserve">`python benchmark.py --backend rfdetr --model models/rfdetr-nano-litter.pth --source data/litter/test-video.mp4 --output reports/generated/jetson-rfdetr.json`</w:t>
+      </w:r>
+    </w:p>
+    <w:p>
+      <w:pPr>
+        <w:spacing w:after="140" w:line="330"/>
+      </w:pPr>
+      <w:r>
+        <w:rPr>
+          <w:rFonts w:ascii="Arial" w:cs="Arial" w:eastAsia="Arial" w:hAnsi="Arial"/>
+          <w:sz w:val="22"/>
+          <w:szCs w:val="22"/>
+        </w:rPr>
+        <w:t xml:space="preserve">Maintainer data preparation and training:</w:t>
+      </w:r>
+    </w:p>
+    <w:p>
+      <w:pPr>
+        <w:spacing w:after="140" w:line="330"/>
+      </w:pPr>
+      <w:r>
+        <w:rPr>
+          <w:rFonts w:ascii="Arial" w:cs="Arial" w:eastAsia="Arial" w:hAnsi="Arial"/>
+          <w:sz w:val="22"/>
+          <w:szCs w:val="22"/>
+        </w:rPr>
+        <w:t xml:space="preserve">`python prepare_training_data.py`</w:t>
+      </w:r>
+    </w:p>
+    <w:p>
+      <w:pPr>
+        <w:spacing w:after="140" w:line="330"/>
+      </w:pPr>
+      <w:r>
+        <w:rPr>
+          <w:rFonts w:ascii="Arial" w:cs="Arial" w:eastAsia="Arial" w:hAnsi="Arial"/>
+          <w:sz w:val="22"/>
+          <w:szCs w:val="22"/>
+        </w:rPr>
+        <w:t xml:space="preserve">`python train.py --data data/taco-operational-v1 --model rfdetr-nano`</w:t>
       </w:r>
     </w:p>
     <w:p>
@@ -5201,7 +5227,7 @@
           <w:sz w:val="22"/>
           <w:szCs w:val="22"/>
         </w:rPr>
-        <w:t xml:space="preserve">Freeze prompt catalog, class guide, data version, and held-out split.</w:t>
+        <w:t xml:space="preserve">Freeze checkpoint, class guide, data version, and held-out split.</w:t>
       </w:r>
     </w:p>
     <w:p>
@@ -5237,20 +5263,7 @@
           <w:sz w:val="22"/>
           <w:szCs w:val="22"/>
         </w:rPr>
-        <w:t xml:space="preserve">Evaluate an optimized artifact only if the public reference runtime does not</w:t>
-      </w:r>
-    </w:p>
-    <w:p>
-      <w:pPr>
-        <w:spacing w:after="140" w:line="330"/>
-      </w:pPr>
-      <w:r>
-        <w:rPr>
-          <w:rFonts w:ascii="Arial" w:cs="Arial" w:eastAsia="Arial" w:hAnsi="Arial"/>
-          <w:sz w:val="22"/>
-          <w:szCs w:val="22"/>
-        </w:rPr>
-        <w:t xml:space="preserve">meet the operational target.</w:t>
+        <w:t xml:space="preserve">Verify the selected exported artifact against the frozen checkpoint.</w:t>
       </w:r>
     </w:p>
     <w:p>

</xml_diff>

<commit_message>
Add operations dashboard and stream workflow
</commit_message>
<xml_diff>
--- a/thesis/Jetson_Litter_Detection_Thesis_Draft.docx
+++ b/thesis/Jetson_Litter_Detection_Thesis_Draft.docx
@@ -1087,6 +1087,37 @@
           <w:sz w:val="22"/>
           <w:szCs w:val="22"/>
         </w:rPr>
+        <w:t xml:space="preserve">provide a local browser interface for starting and stopping a bounded camera,</w:t>
+      </w:r>
+    </w:p>
+    <w:p>
+      <w:pPr>
+        <w:spacing w:after="140" w:line="330"/>
+      </w:pPr>
+      <w:r>
+        <w:rPr>
+          <w:rFonts w:ascii="Arial" w:cs="Arial" w:eastAsia="Arial" w:hAnsi="Arial"/>
+          <w:sz w:val="22"/>
+          <w:szCs w:val="22"/>
+        </w:rPr>
+        <w:t xml:space="preserve">video, HTTP, or RTSP session and observing annotated output;</w:t>
+      </w:r>
+    </w:p>
+    <w:p>
+      <w:pPr>
+        <w:pStyle w:val="ListParagraph"/>
+        <w:numPr>
+          <w:ilvl w:val="0"/>
+          <w:numId w:val="3"/>
+        </w:numPr>
+        <w:spacing w:after="140" w:line="330"/>
+      </w:pPr>
+      <w:r>
+        <w:rPr>
+          <w:rFonts w:ascii="Arial" w:cs="Arial" w:eastAsia="Arial" w:hAnsi="Arial"/>
+          <w:sz w:val="22"/>
+          <w:szCs w:val="22"/>
+        </w:rPr>
         <w:t xml:space="preserve">show a human the predicted material and configured separation destination;</w:t>
       </w:r>
     </w:p>
@@ -1404,7 +1435,25 @@
           <w:sz w:val="22"/>
           <w:szCs w:val="22"/>
         </w:rPr>
-        <w:t xml:space="preserve">minimize retention of raw imagery and personally identifiable information.</w:t>
+        <w:t xml:space="preserve">minimize retention of raw imagery and personally identifiable information;</w:t>
+      </w:r>
+    </w:p>
+    <w:p>
+      <w:pPr>
+        <w:pStyle w:val="ListParagraph"/>
+        <w:numPr>
+          <w:ilvl w:val="0"/>
+          <w:numId w:val="3"/>
+        </w:numPr>
+        <w:spacing w:after="140" w:line="330"/>
+      </w:pPr>
+      <w:r>
+        <w:rPr>
+          <w:rFonts w:ascii="Arial" w:cs="Arial" w:eastAsia="Arial" w:hAnsi="Arial"/>
+          <w:sz w:val="22"/>
+          <w:szCs w:val="22"/>
+        </w:rPr>
+        <w:t xml:space="preserve">keep the operator interface functional without a cloud dependency.</w:t>
       </w:r>
     </w:p>
     <w:p>
@@ -1438,7 +1487,33 @@
           <w:sz w:val="22"/>
           <w:szCs w:val="22"/>
         </w:rPr>
-        <w:t xml:space="preserve">The runtime applies an operator-configured separation policy after tracking. The display presents the predicted material and destination, while low-confidence, hazardous, and other-litter observations are placed in a review queue. Detected objects remain observations; they are not recorded as collected until a human, arm controller, sensor-fusion component, or reviewed import provides a separate positive confirmation. Perception output may inform a task planner but must not directly actuate a collection arm; final motion authority, emergency stops, exclusion zones, and interlocks remain in an independent safety-rated controller. A selected-frame VLM, if enabled later, is downstream and asynchronous.</w:t>
+        <w:t xml:space="preserve">The runtime applies an operator-configured separation policy after tracking. The display presents the predicted material and destination, while low-confidence, hazardous, and other-litter observations are placed in a review queue.</w:t>
+      </w:r>
+    </w:p>
+    <w:p>
+      <w:pPr>
+        <w:spacing w:after="140" w:line="330"/>
+      </w:pPr>
+      <w:r>
+        <w:rPr>
+          <w:rFonts w:ascii="Arial" w:cs="Arial" w:eastAsia="Arial" w:hAnsi="Arial"/>
+          <w:sz w:val="22"/>
+          <w:szCs w:val="22"/>
+        </w:rPr>
+        <w:t xml:space="preserve">A local FastAPI service also hosts a dependency-free browser operations dashboard. The service can own one server-side capture session by default, which allows a remote operator to reference a camera index or local file on the edge computer rather than on the browser computer. The dashboard displays annotated frames, visible counts, unique tracked counts, recent runs, and the human review queue. Dashboard sessions reuse the same detector adapter, tracker, separation policy, SQLite schema, and outbox as the unattended runtime; the interface is therefore an operator view of the application rather than a separate demonstration pipeline.</w:t>
+      </w:r>
+    </w:p>
+    <w:p>
+      <w:pPr>
+        <w:spacing w:after="140" w:line="330"/>
+      </w:pPr>
+      <w:r>
+        <w:rPr>
+          <w:rFonts w:ascii="Arial" w:cs="Arial" w:eastAsia="Arial" w:hAnsi="Arial"/>
+          <w:sz w:val="22"/>
+          <w:szCs w:val="22"/>
+        </w:rPr>
+        <w:t xml:space="preserve">Detected objects remain observations; they are not recorded as collected until a human, arm controller, sensor-fusion component, or reviewed import provides a separate positive confirmation. Perception output may inform a task planner but must not directly actuate a collection arm; final motion authority, emergency stops, exclusion zones, and interlocks remain in an independent safety-rated controller. A selected-frame VLM, if enabled later, is downstream and asynchronous.</w:t>
       </w:r>
     </w:p>
     <w:p>

</xml_diff>